<commit_message>
Removed thesis yang tak berkenaan
</commit_message>
<xml_diff>
--- a/A - THIS IS MY THESIS/RC24201_FYP.docx
+++ b/A - THIS IS MY THESIS/RC24201_FYP.docx
@@ -2187,8 +2187,13 @@
       <w:pPr>
         <w:pStyle w:val="DecContent"/>
       </w:pPr>
-      <w:r>
-        <w:t xml:space="preserve">NOTE : * If the thesis is CONFIDENTIAL or RESTRICTED, please </w:t>
+      <w:proofErr w:type="gramStart"/>
+      <w:r>
+        <w:t>NOTE :</w:t>
+      </w:r>
+      <w:proofErr w:type="gramEnd"/>
+      <w:r>
+        <w:t xml:space="preserve"> * If the thesis is CONFIDENTIAL or RESTRICTED, please </w:t>
       </w:r>
       <w:r>
         <w:t xml:space="preserve">attach </w:t>
@@ -4340,7 +4345,21 @@
                 <w:rPr>
                   <w:lang w:val="en-MY"/>
                 </w:rPr>
-                <w:t>From a technical perspective, the system framework is developed using web technologies such as HTML, CSS, and JavaScript to ensure high accessibility and cross-device compatibility. Furthermore, the system provides administrative functionalities that allow PKU staff to efficiently manage, update, and publish announcements. At the same time, end users, namely students, are able to receive health information and announcements that are tailored to their needs.</w:t>
+                <w:t xml:space="preserve">From a technical perspective, the system framework is developed using web technologies such as HTML, CSS, and JavaScript to ensure high accessibility and cross-device compatibility. Furthermore, the system provides administrative functionalities that allow PKU staff to efficiently manage, update, and publish announcements. At the same time, end users, namely students, </w:t>
+              </w:r>
+              <w:proofErr w:type="gramStart"/>
+              <w:r>
+                <w:rPr>
+                  <w:lang w:val="en-MY"/>
+                </w:rPr>
+                <w:t>are able to</w:t>
+              </w:r>
+              <w:proofErr w:type="gramEnd"/>
+              <w:r>
+                <w:rPr>
+                  <w:lang w:val="en-MY"/>
+                </w:rPr>
+                <w:t xml:space="preserve"> receive health information and announcements that are tailored to their needs.</w:t>
               </w:r>
             </w:p>
             <w:p>
@@ -4818,21 +4837,7 @@
             <w:rStyle w:val="Hyperlink"/>
             <w:noProof/>
           </w:rPr>
-          <w:t>LIST O</w:t>
-        </w:r>
-        <w:r>
-          <w:rPr>
-            <w:rStyle w:val="Hyperlink"/>
-            <w:noProof/>
-          </w:rPr>
-          <w:t>F</w:t>
-        </w:r>
-        <w:r>
-          <w:rPr>
-            <w:rStyle w:val="Hyperlink"/>
-            <w:noProof/>
-          </w:rPr>
-          <w:t xml:space="preserve"> FIGURES</w:t>
+          <w:t>LIST OF FIGURES</w:t>
         </w:r>
         <w:r>
           <w:rPr>
@@ -8167,19 +8172,7 @@
           <w:rPr>
             <w:rStyle w:val="Hyperlink"/>
           </w:rPr>
-          <w:t>Figure 1.2 Gan</w:t>
-        </w:r>
-        <w:r>
-          <w:rPr>
-            <w:rStyle w:val="Hyperlink"/>
-          </w:rPr>
-          <w:t>t</w:t>
-        </w:r>
-        <w:r>
-          <w:rPr>
-            <w:rStyle w:val="Hyperlink"/>
-          </w:rPr>
-          <w:t>t Chart</w:t>
+          <w:t>Figure 1.2 Gantt Chart</w:t>
         </w:r>
         <w:r>
           <w:rPr>
@@ -9825,6 +9818,9 @@
         <w:pStyle w:val="UMPParagraph"/>
       </w:pPr>
       <w:r>
+        <w:rPr>
+          <w:noProof/>
+        </w:rPr>
         <w:drawing>
           <wp:inline distT="0" distB="0" distL="0" distR="0" wp14:anchorId="7580B8A8" wp14:editId="48F00BA4">
             <wp:extent cx="5385435" cy="2500630"/>
@@ -9885,6 +9881,9 @@
         <w:pStyle w:val="UMPParagraph"/>
       </w:pPr>
       <w:r>
+        <w:rPr>
+          <w:noProof/>
+        </w:rPr>
         <w:drawing>
           <wp:inline distT="0" distB="0" distL="0" distR="0" wp14:anchorId="58D8003E" wp14:editId="68F68BC9">
             <wp:extent cx="5385435" cy="2526030"/>
@@ -9958,6 +9957,7 @@
         <w:rPr>
           <w:b/>
           <w:bCs/>
+          <w:noProof/>
         </w:rPr>
         <w:drawing>
           <wp:inline distT="0" distB="0" distL="0" distR="0" wp14:anchorId="3F7AEB74" wp14:editId="35F40737">
@@ -10237,7 +10237,7 @@
               <w:rPr>
                 <w:lang w:val="en-MY"/>
               </w:rPr>
-              <w:t>Easy to navigate</w:t>
+              <w:t>Dense and compact information delivery</w:t>
             </w:r>
           </w:p>
         </w:tc>
@@ -10336,6 +10336,12 @@
                 <w:lang w:val="en-MY"/>
               </w:rPr>
             </w:pPr>
+            <w:r>
+              <w:rPr>
+                <w:lang w:val="en-MY"/>
+              </w:rPr>
+              <w:t>Easy to navigate</w:t>
+            </w:r>
           </w:p>
         </w:tc>
         <w:tc>
@@ -10371,6 +10377,12 @@
                 <w:lang w:val="en-MY"/>
               </w:rPr>
             </w:pPr>
+            <w:r>
+              <w:rPr>
+                <w:lang w:val="en-MY"/>
+              </w:rPr>
+              <w:t xml:space="preserve">  </w:t>
+            </w:r>
           </w:p>
         </w:tc>
       </w:tr>
@@ -10610,11 +10622,17 @@
     </w:tbl>
     <w:p>
       <w:pPr>
-        <w:pStyle w:val="UMPParagraph"/>
+        <w:pStyle w:val="CaptionforTableUMP"/>
         <w:rPr>
           <w:lang w:val="en-MY"/>
         </w:rPr>
       </w:pPr>
+      <w:r>
+        <w:rPr>
+          <w:lang w:val="en-MY"/>
+        </w:rPr>
+        <w:t>Table 2.4 Comparison among existing system</w:t>
+      </w:r>
     </w:p>
     <w:p>
       <w:pPr>
@@ -10718,18 +10736,25 @@
         <w:t xml:space="preserve">The transition from manual, physical communication to a centralized digital framework like the </w:t>
       </w:r>
       <w:r>
-        <w:rPr>
-          <w:b/>
-          <w:bCs/>
-          <w:i/>
-        </w:rPr>
-        <w:t>Interactive PKU Bulletin Board</w:t>
-      </w:r>
-      <w:r>
-        <w:t xml:space="preserve"> is essential for modernizing health services at UMPSA. By leveraging technologies such as HTML, CSS, and</w:t>
-      </w:r>
-      <w:r>
-        <w:t xml:space="preserve"> JavaScript</w:t>
+        <w:t xml:space="preserve">NewsNow </w:t>
+      </w:r>
+      <w:r>
+        <w:rPr>
+          <w:iCs w:val="0"/>
+        </w:rPr>
+        <w:t>PKU Bulletin Board</w:t>
+      </w:r>
+      <w:r>
+        <w:t xml:space="preserve"> is essential for modernizing health services at UMPSA. By leveraging technologies such as HTML, </w:t>
+      </w:r>
+      <w:r>
+        <w:t>React JS</w:t>
+      </w:r>
+      <w:r>
+        <w:t>, and</w:t>
+      </w:r>
+      <w:r>
+        <w:t xml:space="preserve"> Tailwind CSS</w:t>
       </w:r>
       <w:r>
         <w:t>, the project aims to create a responsive environment that improves health literacy and ensures timely information transfer for both students and staff.</w:t>
@@ -10847,53 +10872,11 @@
       <w:r>
         <w:rPr>
           <w:rFonts w:eastAsia="Times New Roman" w:cs="Times New Roman"/>
-          <w:b/>
-          <w:bCs/>
           <w:sz w:val="24"/>
           <w:szCs w:val="24"/>
           <w:lang w:val="en-MY" w:eastAsia="en-MY"/>
         </w:rPr>
-        <w:t>HTML</w:t>
-      </w:r>
-      <w:r>
-        <w:rPr>
-          <w:rFonts w:eastAsia="Times New Roman" w:cs="Times New Roman"/>
-          <w:sz w:val="24"/>
-          <w:szCs w:val="24"/>
-          <w:lang w:val="en-MY" w:eastAsia="en-MY"/>
-        </w:rPr>
-        <w:t xml:space="preserve">, </w:t>
-      </w:r>
-      <w:r>
-        <w:rPr>
-          <w:rFonts w:eastAsia="Times New Roman" w:cs="Times New Roman"/>
-          <w:b/>
-          <w:bCs/>
-          <w:sz w:val="24"/>
-          <w:szCs w:val="24"/>
-          <w:lang w:val="en-MY" w:eastAsia="en-MY"/>
-        </w:rPr>
-        <w:t>React JS</w:t>
-      </w:r>
-      <w:r>
-        <w:rPr>
-          <w:rFonts w:eastAsia="Times New Roman" w:cs="Times New Roman"/>
-          <w:sz w:val="24"/>
-          <w:szCs w:val="24"/>
-          <w:lang w:val="en-MY" w:eastAsia="en-MY"/>
-        </w:rPr>
-        <w:t xml:space="preserve">, and </w:t>
-      </w:r>
-      <w:r>
-        <w:rPr>
-          <w:rFonts w:eastAsia="Times New Roman" w:cs="Times New Roman"/>
-          <w:b/>
-          <w:bCs/>
-          <w:sz w:val="24"/>
-          <w:szCs w:val="24"/>
-          <w:lang w:val="en-MY" w:eastAsia="en-MY"/>
-        </w:rPr>
-        <w:t>Tailwind CSS</w:t>
+        <w:t>HTML, React JS, and Tailwind CSS</w:t>
       </w:r>
       <w:r>
         <w:rPr>
@@ -10958,7 +10941,7 @@
           <w:noProof/>
         </w:rPr>
         <w:drawing>
-          <wp:inline distT="0" distB="0" distL="0" distR="0" wp14:anchorId="1E76D399" wp14:editId="692D99A8">
+          <wp:inline distT="0" distB="0" distL="0" distR="0" wp14:anchorId="1E76D399" wp14:editId="0B529AA2">
             <wp:extent cx="5385435" cy="1687285"/>
             <wp:effectExtent l="0" t="0" r="5715" b="8255"/>
             <wp:docPr id="1266762895" name="Picture 12" descr="Rapid Application Development Pros And Cons"/>
@@ -11579,7 +11562,15 @@
         <w:pStyle w:val="Heading7"/>
       </w:pPr>
       <w:r>
-        <w:t>The system shall be responsive and usable on screen sizes ranging from mobile phones to desktop monitors.</w:t>
+        <w:t xml:space="preserve">The system shall be responsive and usable </w:t>
+      </w:r>
+      <w:proofErr w:type="gramStart"/>
+      <w:r>
+        <w:t>on screen</w:t>
+      </w:r>
+      <w:proofErr w:type="gramEnd"/>
+      <w:r>
+        <w:t xml:space="preserve"> sizes ranging from mobile phones to desktop monitors.</w:t>
       </w:r>
     </w:p>
     <w:p>
@@ -11968,7 +11959,7 @@
           <w:noProof/>
         </w:rPr>
         <w:drawing>
-          <wp:anchor distT="0" distB="0" distL="114300" distR="114300" simplePos="0" relativeHeight="251660288" behindDoc="0" locked="0" layoutInCell="1" allowOverlap="1" wp14:anchorId="1221A6F4" wp14:editId="77B15598">
+          <wp:anchor distT="0" distB="0" distL="114300" distR="114300" simplePos="0" relativeHeight="251660288" behindDoc="0" locked="0" layoutInCell="1" allowOverlap="1" wp14:anchorId="1221A6F4" wp14:editId="7238E268">
             <wp:simplePos x="0" y="0"/>
             <wp:positionH relativeFrom="page">
               <wp:posOffset>617220</wp:posOffset>
@@ -12585,6 +12576,9 @@
         <w:pStyle w:val="UMPParagraph"/>
       </w:pPr>
       <w:r>
+        <w:rPr>
+          <w:noProof/>
+        </w:rPr>
         <w:drawing>
           <wp:inline distT="0" distB="0" distL="0" distR="0" wp14:anchorId="7F7ADD6A" wp14:editId="6675DB21">
             <wp:extent cx="5385435" cy="3181350"/>
@@ -13496,6 +13490,9 @@
               <w:pStyle w:val="UMPParagraph"/>
             </w:pPr>
             <w:r>
+              <w:rPr>
+                <w:noProof/>
+              </w:rPr>
               <w:drawing>
                 <wp:inline distT="0" distB="0" distL="0" distR="0" wp14:anchorId="1C6D4E38" wp14:editId="285E6EDF">
                   <wp:extent cx="5385435" cy="2515235"/>
@@ -13839,6 +13836,9 @@
               <w:pStyle w:val="UMPParagraph"/>
             </w:pPr>
             <w:r>
+              <w:rPr>
+                <w:noProof/>
+              </w:rPr>
               <w:drawing>
                 <wp:inline distT="0" distB="0" distL="0" distR="0" wp14:anchorId="2220F9CE" wp14:editId="661C128D">
                   <wp:extent cx="5385435" cy="2526030"/>
@@ -14105,10 +14105,7 @@
               <w:pStyle w:val="UMPParagraph"/>
             </w:pPr>
             <w:r>
-              <w:t xml:space="preserve">Admin </w:t>
-            </w:r>
-            <w:r>
-              <w:t>Dashboard</w:t>
+              <w:t>Admin Dashboard</w:t>
             </w:r>
           </w:p>
         </w:tc>
@@ -14139,6 +14136,9 @@
               <w:pStyle w:val="UMPParagraph"/>
             </w:pPr>
             <w:r>
+              <w:rPr>
+                <w:noProof/>
+              </w:rPr>
               <w:drawing>
                 <wp:inline distT="0" distB="0" distL="0" distR="0" wp14:anchorId="253C0CAB" wp14:editId="0BBECAB9">
                   <wp:extent cx="5385435" cy="2519045"/>
@@ -14438,6 +14438,9 @@
               <w:pStyle w:val="UMPParagraph"/>
             </w:pPr>
             <w:r>
+              <w:rPr>
+                <w:noProof/>
+              </w:rPr>
               <w:drawing>
                 <wp:inline distT="0" distB="0" distL="0" distR="0" wp14:anchorId="22BF3944" wp14:editId="1D04BCEC">
                   <wp:extent cx="5385435" cy="2494280"/>
@@ -14763,6 +14766,9 @@
               <w:pStyle w:val="UMPParagraph"/>
             </w:pPr>
             <w:r>
+              <w:rPr>
+                <w:noProof/>
+              </w:rPr>
               <w:drawing>
                 <wp:inline distT="0" distB="0" distL="0" distR="0" wp14:anchorId="2DA76C7B" wp14:editId="0AF96D39">
                   <wp:extent cx="5385435" cy="2490470"/>
@@ -15091,6 +15097,9 @@
               <w:pStyle w:val="UMPParagraph"/>
             </w:pPr>
             <w:r>
+              <w:rPr>
+                <w:noProof/>
+              </w:rPr>
               <w:drawing>
                 <wp:inline distT="0" distB="0" distL="0" distR="0" wp14:anchorId="1FE194BB" wp14:editId="2C1393D0">
                   <wp:extent cx="5385435" cy="2494915"/>
@@ -16600,7 +16609,7 @@
           <w:noProof/>
         </w:rPr>
         <w:drawing>
-          <wp:inline distT="0" distB="0" distL="0" distR="0" wp14:anchorId="028E6A34" wp14:editId="52646F5B">
+          <wp:inline distT="0" distB="0" distL="0" distR="0" wp14:anchorId="028E6A34" wp14:editId="2206996E">
             <wp:extent cx="5385435" cy="1835150"/>
             <wp:effectExtent l="0" t="0" r="5715" b="0"/>
             <wp:docPr id="439804823" name="Picture 2"/>
@@ -16742,18 +16751,925 @@
         <w:pStyle w:val="UMPParagraph"/>
       </w:pPr>
       <w:r>
-        <w:t>This chapter presents the findings derived from the implementation and testing phases of the project. It evaluates the system's performance against the initial requirements and discusses the implications of the results. The data gathered provides a comprehensive look at how the solution addresses the identified research problem, highlighting both successful outcomes and areas for future optimization.</w:t>
-      </w:r>
+        <w:t xml:space="preserve">This chapter presents the evaluation results and empirical findings of the developed Interactive PKU Bulletin Board system, known as “NewsNow”. The primary goal of this evaluation was to </w:t>
+      </w:r>
+      <w:proofErr w:type="spellStart"/>
+      <w:r>
+        <w:t>analyze</w:t>
+      </w:r>
+      <w:proofErr w:type="spellEnd"/>
+      <w:r>
+        <w:t xml:space="preserve"> if the developed web platform meets the required system standards, specifically focusing on information accessibility, administrative efficiency, and cross-platform responsiveness. To validate the performance and user satisfaction of the system, a comprehensive User Acceptance Testing (UAT) session and a comparative evaluation survey were executed with thirty-four ($N=34$) target university respondents.</w:t>
+      </w:r>
+    </w:p>
+    <w:p>
+      <w:pPr>
+        <w:pStyle w:val="UMPParagraph"/>
+      </w:pPr>
     </w:p>
     <w:p>
       <w:pPr>
         <w:pStyle w:val="Heading2"/>
       </w:pPr>
-      <w:bookmarkStart w:id="49" w:name="_Toc227920996"/>
-      <w:r>
-        <w:t>Table</w:t>
-      </w:r>
-      <w:bookmarkEnd w:id="49"/>
+      <w:r>
+        <w:t>Presentation of Results</w:t>
+      </w:r>
+    </w:p>
+    <w:p>
+      <w:pPr>
+        <w:pStyle w:val="UMPParagraph"/>
+      </w:pPr>
+      <w:r>
+        <w:t>This section illustrates the quantitative data gathered from the target respondents. The collected data is structurally categorized into primary evaluation layers: the demographic profile of the participants, functional verification under Research Objective 2, and a comparative tool evaluation contrasting NewsNow against traditional university health communication channels.</w:t>
+      </w:r>
+    </w:p>
+    <w:p>
+      <w:pPr>
+        <w:pStyle w:val="UMPParagraph"/>
+      </w:pPr>
+    </w:p>
+    <w:p>
+      <w:pPr>
+        <w:pStyle w:val="Heading3"/>
+        <w:spacing w:after="240"/>
+      </w:pPr>
+      <w:r>
+        <w:t>Demographic Profile of Respondents</w:t>
+      </w:r>
+    </w:p>
+    <w:p>
+      <w:pPr>
+        <w:pStyle w:val="UMPParagraph"/>
+        <w:rPr>
+          <w:lang w:val="en-MY"/>
+        </w:rPr>
+      </w:pPr>
+      <w:r>
+        <w:rPr>
+          <w:lang w:val="en-MY"/>
+        </w:rPr>
+        <w:t xml:space="preserve">The survey captured responses from a diverse mix of university youth to ensure a well-rounded assessment of the user interface. </w:t>
+      </w:r>
+    </w:p>
+    <w:p>
+      <w:pPr>
+        <w:pStyle w:val="UMPParagraph"/>
+        <w:numPr>
+          <w:ilvl w:val="0"/>
+          <w:numId w:val="33"/>
+        </w:numPr>
+        <w:rPr>
+          <w:lang w:val="en-MY"/>
+        </w:rPr>
+      </w:pPr>
+      <w:r>
+        <w:rPr>
+          <w:b/>
+          <w:bCs/>
+          <w:lang w:val="en-MY"/>
+        </w:rPr>
+        <w:t>Academic Distribution:</w:t>
+      </w:r>
+      <w:r>
+        <w:rPr>
+          <w:lang w:val="en-MY"/>
+        </w:rPr>
+        <w:t xml:space="preserve"> Out of the 34 total participants, 58.8% ($n=20$) were Diploma students, and 41.2% ($n=14$) were Degree students. </w:t>
+      </w:r>
+    </w:p>
+    <w:p>
+      <w:pPr>
+        <w:pStyle w:val="UMPParagraph"/>
+        <w:numPr>
+          <w:ilvl w:val="0"/>
+          <w:numId w:val="33"/>
+        </w:numPr>
+        <w:rPr>
+          <w:lang w:val="en-MY"/>
+        </w:rPr>
+      </w:pPr>
+      <w:r>
+        <w:rPr>
+          <w:b/>
+          <w:bCs/>
+          <w:lang w:val="en-MY"/>
+        </w:rPr>
+        <w:lastRenderedPageBreak/>
+        <w:t>Institutional Representation:</w:t>
+      </w:r>
+      <w:r>
+        <w:rPr>
+          <w:lang w:val="en-MY"/>
+        </w:rPr>
+        <w:t xml:space="preserve"> The peer network primarily comprised students and staff from the local university ecosystem, ensuring the testing was conducted by actual stakeholders of the campus environment. </w:t>
+      </w:r>
+    </w:p>
+    <w:p>
+      <w:pPr>
+        <w:pStyle w:val="UMPParagraph"/>
+      </w:pPr>
+    </w:p>
+    <w:p>
+      <w:pPr>
+        <w:pStyle w:val="Heading3"/>
+        <w:spacing w:after="240"/>
+      </w:pPr>
+      <w:r>
+        <w:t>Core System Performance Evaluation</w:t>
+      </w:r>
+    </w:p>
+    <w:p>
+      <w:pPr>
+        <w:pStyle w:val="UMPParagraph"/>
+        <w:rPr>
+          <w:lang w:val="en-MY"/>
+        </w:rPr>
+      </w:pPr>
+      <w:r>
+        <w:rPr>
+          <w:lang w:val="en-MY"/>
+        </w:rPr>
+        <w:t>A 5-point Likert scale (ranging from 1 = Strongly Disagree to 5 = Strongly Agree) was utilized to measure system performance indicators.</w:t>
+      </w:r>
+    </w:p>
+    <w:p>
+      <w:pPr>
+        <w:pStyle w:val="UMPParagraph"/>
+        <w:rPr>
+          <w:lang w:val="en-MY"/>
+        </w:rPr>
+      </w:pPr>
+      <w:r>
+        <w:rPr>
+          <w:lang w:val="en-MY"/>
+        </w:rPr>
+        <w:t xml:space="preserve">The system's capacity to instantaneously broadcast health notices and emergency announcements without database lagging was evaluated. </w:t>
+      </w:r>
+    </w:p>
+    <w:tbl>
+      <w:tblPr>
+        <w:tblW w:w="0" w:type="auto"/>
+        <w:tblCellSpacing w:w="15" w:type="dxa"/>
+        <w:tblCellMar>
+          <w:top w:w="15" w:type="dxa"/>
+          <w:left w:w="15" w:type="dxa"/>
+          <w:bottom w:w="15" w:type="dxa"/>
+          <w:right w:w="15" w:type="dxa"/>
+        </w:tblCellMar>
+        <w:tblLook w:val="04A0" w:firstRow="1" w:lastRow="0" w:firstColumn="1" w:lastColumn="0" w:noHBand="0" w:noVBand="1"/>
+      </w:tblPr>
+      <w:tblGrid>
+        <w:gridCol w:w="2515"/>
+        <w:gridCol w:w="3033"/>
+        <w:gridCol w:w="2703"/>
+      </w:tblGrid>
+      <w:tr>
+        <w:trPr>
+          <w:tblHeader/>
+          <w:tblCellSpacing w:w="15" w:type="dxa"/>
+        </w:trPr>
+        <w:tc>
+          <w:tcPr>
+            <w:tcW w:w="0" w:type="auto"/>
+            <w:tcBorders>
+              <w:top w:val="single" w:sz="6" w:space="0" w:color="C4C7C5"/>
+              <w:left w:val="single" w:sz="6" w:space="0" w:color="C4C7C5"/>
+              <w:bottom w:val="single" w:sz="6" w:space="0" w:color="C4C7C5"/>
+              <w:right w:val="single" w:sz="6" w:space="0" w:color="C4C7C5"/>
+            </w:tcBorders>
+            <w:tcMar>
+              <w:top w:w="120" w:type="dxa"/>
+              <w:left w:w="180" w:type="dxa"/>
+              <w:bottom w:w="120" w:type="dxa"/>
+              <w:right w:w="180" w:type="dxa"/>
+            </w:tcMar>
+            <w:vAlign w:val="center"/>
+            <w:hideMark/>
+          </w:tcPr>
+          <w:p>
+            <w:pPr>
+              <w:pStyle w:val="UMPParagraph"/>
+              <w:rPr>
+                <w:lang w:val="en-MY"/>
+              </w:rPr>
+            </w:pPr>
+            <w:r>
+              <w:rPr>
+                <w:b/>
+                <w:bCs/>
+                <w:lang w:val="en-MY"/>
+              </w:rPr>
+              <w:t>Likert Rating</w:t>
+            </w:r>
+          </w:p>
+        </w:tc>
+        <w:tc>
+          <w:tcPr>
+            <w:tcW w:w="0" w:type="auto"/>
+            <w:tcBorders>
+              <w:top w:val="single" w:sz="6" w:space="0" w:color="C4C7C5"/>
+              <w:left w:val="single" w:sz="6" w:space="0" w:color="C4C7C5"/>
+              <w:bottom w:val="single" w:sz="6" w:space="0" w:color="C4C7C5"/>
+              <w:right w:val="single" w:sz="6" w:space="0" w:color="C4C7C5"/>
+            </w:tcBorders>
+            <w:tcMar>
+              <w:top w:w="120" w:type="dxa"/>
+              <w:left w:w="180" w:type="dxa"/>
+              <w:bottom w:w="120" w:type="dxa"/>
+              <w:right w:w="180" w:type="dxa"/>
+            </w:tcMar>
+            <w:vAlign w:val="center"/>
+            <w:hideMark/>
+          </w:tcPr>
+          <w:p>
+            <w:pPr>
+              <w:pStyle w:val="UMPParagraph"/>
+              <w:rPr>
+                <w:lang w:val="en-MY"/>
+              </w:rPr>
+            </w:pPr>
+            <w:r>
+              <w:rPr>
+                <w:b/>
+                <w:bCs/>
+                <w:lang w:val="en-MY"/>
+              </w:rPr>
+              <w:t>Response Percentage (%)</w:t>
+            </w:r>
+          </w:p>
+        </w:tc>
+        <w:tc>
+          <w:tcPr>
+            <w:tcW w:w="0" w:type="auto"/>
+            <w:tcBorders>
+              <w:top w:val="single" w:sz="6" w:space="0" w:color="C4C7C5"/>
+              <w:left w:val="single" w:sz="6" w:space="0" w:color="C4C7C5"/>
+              <w:bottom w:val="single" w:sz="6" w:space="0" w:color="C4C7C5"/>
+              <w:right w:val="single" w:sz="6" w:space="0" w:color="C4C7C5"/>
+            </w:tcBorders>
+            <w:tcMar>
+              <w:top w:w="120" w:type="dxa"/>
+              <w:left w:w="180" w:type="dxa"/>
+              <w:bottom w:w="120" w:type="dxa"/>
+              <w:right w:w="180" w:type="dxa"/>
+            </w:tcMar>
+            <w:vAlign w:val="center"/>
+            <w:hideMark/>
+          </w:tcPr>
+          <w:p>
+            <w:pPr>
+              <w:pStyle w:val="UMPParagraph"/>
+              <w:rPr>
+                <w:lang w:val="en-MY"/>
+              </w:rPr>
+            </w:pPr>
+            <w:r>
+              <w:rPr>
+                <w:b/>
+                <w:bCs/>
+                <w:lang w:val="en-MY"/>
+              </w:rPr>
+              <w:t>Respondent Count (n)</w:t>
+            </w:r>
+          </w:p>
+        </w:tc>
+      </w:tr>
+      <w:tr>
+        <w:trPr>
+          <w:tblCellSpacing w:w="15" w:type="dxa"/>
+        </w:trPr>
+        <w:tc>
+          <w:tcPr>
+            <w:tcW w:w="0" w:type="auto"/>
+            <w:tcBorders>
+              <w:top w:val="single" w:sz="6" w:space="0" w:color="C4C7C5"/>
+              <w:left w:val="single" w:sz="6" w:space="0" w:color="C4C7C5"/>
+              <w:bottom w:val="single" w:sz="6" w:space="0" w:color="C4C7C5"/>
+              <w:right w:val="single" w:sz="6" w:space="0" w:color="C4C7C5"/>
+            </w:tcBorders>
+            <w:tcMar>
+              <w:top w:w="120" w:type="dxa"/>
+              <w:left w:w="180" w:type="dxa"/>
+              <w:bottom w:w="120" w:type="dxa"/>
+              <w:right w:w="180" w:type="dxa"/>
+            </w:tcMar>
+            <w:vAlign w:val="center"/>
+            <w:hideMark/>
+          </w:tcPr>
+          <w:p>
+            <w:pPr>
+              <w:pStyle w:val="UMPParagraph"/>
+              <w:rPr>
+                <w:lang w:val="en-MY"/>
+              </w:rPr>
+            </w:pPr>
+            <w:r>
+              <w:rPr>
+                <w:lang w:val="en-MY"/>
+              </w:rPr>
+              <w:t>5 (Strongly Agree)</w:t>
+            </w:r>
+          </w:p>
+        </w:tc>
+        <w:tc>
+          <w:tcPr>
+            <w:tcW w:w="0" w:type="auto"/>
+            <w:tcBorders>
+              <w:top w:val="single" w:sz="6" w:space="0" w:color="C4C7C5"/>
+              <w:left w:val="single" w:sz="6" w:space="0" w:color="C4C7C5"/>
+              <w:bottom w:val="single" w:sz="6" w:space="0" w:color="C4C7C5"/>
+              <w:right w:val="single" w:sz="6" w:space="0" w:color="C4C7C5"/>
+            </w:tcBorders>
+            <w:tcMar>
+              <w:top w:w="120" w:type="dxa"/>
+              <w:left w:w="180" w:type="dxa"/>
+              <w:bottom w:w="120" w:type="dxa"/>
+              <w:right w:w="180" w:type="dxa"/>
+            </w:tcMar>
+            <w:vAlign w:val="center"/>
+            <w:hideMark/>
+          </w:tcPr>
+          <w:p>
+            <w:pPr>
+              <w:pStyle w:val="UMPParagraph"/>
+              <w:rPr>
+                <w:lang w:val="en-MY"/>
+              </w:rPr>
+            </w:pPr>
+            <w:r>
+              <w:rPr>
+                <w:lang w:val="en-MY"/>
+              </w:rPr>
+              <w:t>52.9%</w:t>
+            </w:r>
+          </w:p>
+        </w:tc>
+        <w:tc>
+          <w:tcPr>
+            <w:tcW w:w="0" w:type="auto"/>
+            <w:tcBorders>
+              <w:top w:val="single" w:sz="6" w:space="0" w:color="C4C7C5"/>
+              <w:left w:val="single" w:sz="6" w:space="0" w:color="C4C7C5"/>
+              <w:bottom w:val="single" w:sz="6" w:space="0" w:color="C4C7C5"/>
+              <w:right w:val="single" w:sz="6" w:space="0" w:color="C4C7C5"/>
+            </w:tcBorders>
+            <w:tcMar>
+              <w:top w:w="120" w:type="dxa"/>
+              <w:left w:w="180" w:type="dxa"/>
+              <w:bottom w:w="120" w:type="dxa"/>
+              <w:right w:w="180" w:type="dxa"/>
+            </w:tcMar>
+            <w:vAlign w:val="center"/>
+            <w:hideMark/>
+          </w:tcPr>
+          <w:p>
+            <w:pPr>
+              <w:pStyle w:val="UMPParagraph"/>
+              <w:rPr>
+                <w:lang w:val="en-MY"/>
+              </w:rPr>
+            </w:pPr>
+            <w:r>
+              <w:rPr>
+                <w:lang w:val="en-MY"/>
+              </w:rPr>
+              <w:t>$n = 18$</w:t>
+            </w:r>
+          </w:p>
+        </w:tc>
+      </w:tr>
+      <w:tr>
+        <w:trPr>
+          <w:tblCellSpacing w:w="15" w:type="dxa"/>
+        </w:trPr>
+        <w:tc>
+          <w:tcPr>
+            <w:tcW w:w="0" w:type="auto"/>
+            <w:tcBorders>
+              <w:top w:val="single" w:sz="6" w:space="0" w:color="C4C7C5"/>
+              <w:left w:val="single" w:sz="6" w:space="0" w:color="C4C7C5"/>
+              <w:bottom w:val="single" w:sz="6" w:space="0" w:color="C4C7C5"/>
+              <w:right w:val="single" w:sz="6" w:space="0" w:color="C4C7C5"/>
+            </w:tcBorders>
+            <w:tcMar>
+              <w:top w:w="120" w:type="dxa"/>
+              <w:left w:w="180" w:type="dxa"/>
+              <w:bottom w:w="120" w:type="dxa"/>
+              <w:right w:w="180" w:type="dxa"/>
+            </w:tcMar>
+            <w:vAlign w:val="center"/>
+            <w:hideMark/>
+          </w:tcPr>
+          <w:p>
+            <w:pPr>
+              <w:pStyle w:val="UMPParagraph"/>
+              <w:rPr>
+                <w:lang w:val="en-MY"/>
+              </w:rPr>
+            </w:pPr>
+            <w:r>
+              <w:rPr>
+                <w:lang w:val="en-MY"/>
+              </w:rPr>
+              <w:t>4 (Agree)</w:t>
+            </w:r>
+          </w:p>
+        </w:tc>
+        <w:tc>
+          <w:tcPr>
+            <w:tcW w:w="0" w:type="auto"/>
+            <w:tcBorders>
+              <w:top w:val="single" w:sz="6" w:space="0" w:color="C4C7C5"/>
+              <w:left w:val="single" w:sz="6" w:space="0" w:color="C4C7C5"/>
+              <w:bottom w:val="single" w:sz="6" w:space="0" w:color="C4C7C5"/>
+              <w:right w:val="single" w:sz="6" w:space="0" w:color="C4C7C5"/>
+            </w:tcBorders>
+            <w:tcMar>
+              <w:top w:w="120" w:type="dxa"/>
+              <w:left w:w="180" w:type="dxa"/>
+              <w:bottom w:w="120" w:type="dxa"/>
+              <w:right w:w="180" w:type="dxa"/>
+            </w:tcMar>
+            <w:vAlign w:val="center"/>
+            <w:hideMark/>
+          </w:tcPr>
+          <w:p>
+            <w:pPr>
+              <w:pStyle w:val="UMPParagraph"/>
+              <w:rPr>
+                <w:lang w:val="en-MY"/>
+              </w:rPr>
+            </w:pPr>
+            <w:r>
+              <w:rPr>
+                <w:lang w:val="en-MY"/>
+              </w:rPr>
+              <w:t>20.6%</w:t>
+            </w:r>
+          </w:p>
+        </w:tc>
+        <w:tc>
+          <w:tcPr>
+            <w:tcW w:w="0" w:type="auto"/>
+            <w:tcBorders>
+              <w:top w:val="single" w:sz="6" w:space="0" w:color="C4C7C5"/>
+              <w:left w:val="single" w:sz="6" w:space="0" w:color="C4C7C5"/>
+              <w:bottom w:val="single" w:sz="6" w:space="0" w:color="C4C7C5"/>
+              <w:right w:val="single" w:sz="6" w:space="0" w:color="C4C7C5"/>
+            </w:tcBorders>
+            <w:tcMar>
+              <w:top w:w="120" w:type="dxa"/>
+              <w:left w:w="180" w:type="dxa"/>
+              <w:bottom w:w="120" w:type="dxa"/>
+              <w:right w:w="180" w:type="dxa"/>
+            </w:tcMar>
+            <w:vAlign w:val="center"/>
+            <w:hideMark/>
+          </w:tcPr>
+          <w:p>
+            <w:pPr>
+              <w:pStyle w:val="UMPParagraph"/>
+              <w:rPr>
+                <w:lang w:val="en-MY"/>
+              </w:rPr>
+            </w:pPr>
+            <w:r>
+              <w:rPr>
+                <w:lang w:val="en-MY"/>
+              </w:rPr>
+              <w:t>$n = 7$</w:t>
+            </w:r>
+          </w:p>
+        </w:tc>
+      </w:tr>
+      <w:tr>
+        <w:trPr>
+          <w:tblCellSpacing w:w="15" w:type="dxa"/>
+        </w:trPr>
+        <w:tc>
+          <w:tcPr>
+            <w:tcW w:w="0" w:type="auto"/>
+            <w:tcBorders>
+              <w:top w:val="single" w:sz="6" w:space="0" w:color="C4C7C5"/>
+              <w:left w:val="single" w:sz="6" w:space="0" w:color="C4C7C5"/>
+              <w:bottom w:val="single" w:sz="6" w:space="0" w:color="C4C7C5"/>
+              <w:right w:val="single" w:sz="6" w:space="0" w:color="C4C7C5"/>
+            </w:tcBorders>
+            <w:tcMar>
+              <w:top w:w="120" w:type="dxa"/>
+              <w:left w:w="180" w:type="dxa"/>
+              <w:bottom w:w="120" w:type="dxa"/>
+              <w:right w:w="180" w:type="dxa"/>
+            </w:tcMar>
+            <w:vAlign w:val="center"/>
+            <w:hideMark/>
+          </w:tcPr>
+          <w:p>
+            <w:pPr>
+              <w:pStyle w:val="UMPParagraph"/>
+              <w:rPr>
+                <w:lang w:val="en-MY"/>
+              </w:rPr>
+            </w:pPr>
+            <w:r>
+              <w:rPr>
+                <w:lang w:val="en-MY"/>
+              </w:rPr>
+              <w:t>3 (Neutral)</w:t>
+            </w:r>
+          </w:p>
+        </w:tc>
+        <w:tc>
+          <w:tcPr>
+            <w:tcW w:w="0" w:type="auto"/>
+            <w:tcBorders>
+              <w:top w:val="single" w:sz="6" w:space="0" w:color="C4C7C5"/>
+              <w:left w:val="single" w:sz="6" w:space="0" w:color="C4C7C5"/>
+              <w:bottom w:val="single" w:sz="6" w:space="0" w:color="C4C7C5"/>
+              <w:right w:val="single" w:sz="6" w:space="0" w:color="C4C7C5"/>
+            </w:tcBorders>
+            <w:tcMar>
+              <w:top w:w="120" w:type="dxa"/>
+              <w:left w:w="180" w:type="dxa"/>
+              <w:bottom w:w="120" w:type="dxa"/>
+              <w:right w:w="180" w:type="dxa"/>
+            </w:tcMar>
+            <w:vAlign w:val="center"/>
+            <w:hideMark/>
+          </w:tcPr>
+          <w:p>
+            <w:pPr>
+              <w:pStyle w:val="UMPParagraph"/>
+              <w:rPr>
+                <w:lang w:val="en-MY"/>
+              </w:rPr>
+            </w:pPr>
+            <w:r>
+              <w:rPr>
+                <w:lang w:val="en-MY"/>
+              </w:rPr>
+              <w:t>11.8%</w:t>
+            </w:r>
+          </w:p>
+        </w:tc>
+        <w:tc>
+          <w:tcPr>
+            <w:tcW w:w="0" w:type="auto"/>
+            <w:tcBorders>
+              <w:top w:val="single" w:sz="6" w:space="0" w:color="C4C7C5"/>
+              <w:left w:val="single" w:sz="6" w:space="0" w:color="C4C7C5"/>
+              <w:bottom w:val="single" w:sz="6" w:space="0" w:color="C4C7C5"/>
+              <w:right w:val="single" w:sz="6" w:space="0" w:color="C4C7C5"/>
+            </w:tcBorders>
+            <w:tcMar>
+              <w:top w:w="120" w:type="dxa"/>
+              <w:left w:w="180" w:type="dxa"/>
+              <w:bottom w:w="120" w:type="dxa"/>
+              <w:right w:w="180" w:type="dxa"/>
+            </w:tcMar>
+            <w:vAlign w:val="center"/>
+            <w:hideMark/>
+          </w:tcPr>
+          <w:p>
+            <w:pPr>
+              <w:pStyle w:val="UMPParagraph"/>
+              <w:rPr>
+                <w:lang w:val="en-MY"/>
+              </w:rPr>
+            </w:pPr>
+            <w:r>
+              <w:rPr>
+                <w:lang w:val="en-MY"/>
+              </w:rPr>
+              <w:t>$n = 4$</w:t>
+            </w:r>
+          </w:p>
+        </w:tc>
+      </w:tr>
+      <w:tr>
+        <w:trPr>
+          <w:tblCellSpacing w:w="15" w:type="dxa"/>
+        </w:trPr>
+        <w:tc>
+          <w:tcPr>
+            <w:tcW w:w="0" w:type="auto"/>
+            <w:tcBorders>
+              <w:top w:val="single" w:sz="6" w:space="0" w:color="C4C7C5"/>
+              <w:left w:val="single" w:sz="6" w:space="0" w:color="C4C7C5"/>
+              <w:bottom w:val="single" w:sz="6" w:space="0" w:color="C4C7C5"/>
+              <w:right w:val="single" w:sz="6" w:space="0" w:color="C4C7C5"/>
+            </w:tcBorders>
+            <w:tcMar>
+              <w:top w:w="120" w:type="dxa"/>
+              <w:left w:w="180" w:type="dxa"/>
+              <w:bottom w:w="120" w:type="dxa"/>
+              <w:right w:w="180" w:type="dxa"/>
+            </w:tcMar>
+            <w:vAlign w:val="center"/>
+            <w:hideMark/>
+          </w:tcPr>
+          <w:p>
+            <w:pPr>
+              <w:pStyle w:val="UMPParagraph"/>
+              <w:rPr>
+                <w:lang w:val="en-MY"/>
+              </w:rPr>
+            </w:pPr>
+            <w:r>
+              <w:rPr>
+                <w:lang w:val="en-MY"/>
+              </w:rPr>
+              <w:t>2 (Disagree)</w:t>
+            </w:r>
+          </w:p>
+        </w:tc>
+        <w:tc>
+          <w:tcPr>
+            <w:tcW w:w="0" w:type="auto"/>
+            <w:tcBorders>
+              <w:top w:val="single" w:sz="6" w:space="0" w:color="C4C7C5"/>
+              <w:left w:val="single" w:sz="6" w:space="0" w:color="C4C7C5"/>
+              <w:bottom w:val="single" w:sz="6" w:space="0" w:color="C4C7C5"/>
+              <w:right w:val="single" w:sz="6" w:space="0" w:color="C4C7C5"/>
+            </w:tcBorders>
+            <w:tcMar>
+              <w:top w:w="120" w:type="dxa"/>
+              <w:left w:w="180" w:type="dxa"/>
+              <w:bottom w:w="120" w:type="dxa"/>
+              <w:right w:w="180" w:type="dxa"/>
+            </w:tcMar>
+            <w:vAlign w:val="center"/>
+            <w:hideMark/>
+          </w:tcPr>
+          <w:p>
+            <w:pPr>
+              <w:pStyle w:val="UMPParagraph"/>
+              <w:rPr>
+                <w:lang w:val="en-MY"/>
+              </w:rPr>
+            </w:pPr>
+            <w:r>
+              <w:rPr>
+                <w:lang w:val="en-MY"/>
+              </w:rPr>
+              <w:t>11.8%</w:t>
+            </w:r>
+          </w:p>
+        </w:tc>
+        <w:tc>
+          <w:tcPr>
+            <w:tcW w:w="0" w:type="auto"/>
+            <w:tcBorders>
+              <w:top w:val="single" w:sz="6" w:space="0" w:color="C4C7C5"/>
+              <w:left w:val="single" w:sz="6" w:space="0" w:color="C4C7C5"/>
+              <w:bottom w:val="single" w:sz="6" w:space="0" w:color="C4C7C5"/>
+              <w:right w:val="single" w:sz="6" w:space="0" w:color="C4C7C5"/>
+            </w:tcBorders>
+            <w:tcMar>
+              <w:top w:w="120" w:type="dxa"/>
+              <w:left w:w="180" w:type="dxa"/>
+              <w:bottom w:w="120" w:type="dxa"/>
+              <w:right w:w="180" w:type="dxa"/>
+            </w:tcMar>
+            <w:vAlign w:val="center"/>
+            <w:hideMark/>
+          </w:tcPr>
+          <w:p>
+            <w:pPr>
+              <w:pStyle w:val="UMPParagraph"/>
+              <w:rPr>
+                <w:lang w:val="en-MY"/>
+              </w:rPr>
+            </w:pPr>
+            <w:r>
+              <w:rPr>
+                <w:lang w:val="en-MY"/>
+              </w:rPr>
+              <w:t>$n = 4$</w:t>
+            </w:r>
+          </w:p>
+        </w:tc>
+      </w:tr>
+      <w:tr>
+        <w:trPr>
+          <w:tblCellSpacing w:w="15" w:type="dxa"/>
+        </w:trPr>
+        <w:tc>
+          <w:tcPr>
+            <w:tcW w:w="0" w:type="auto"/>
+            <w:tcBorders>
+              <w:top w:val="single" w:sz="6" w:space="0" w:color="C4C7C5"/>
+              <w:left w:val="single" w:sz="6" w:space="0" w:color="C4C7C5"/>
+              <w:bottom w:val="single" w:sz="6" w:space="0" w:color="C4C7C5"/>
+              <w:right w:val="single" w:sz="6" w:space="0" w:color="C4C7C5"/>
+            </w:tcBorders>
+            <w:tcMar>
+              <w:top w:w="120" w:type="dxa"/>
+              <w:left w:w="180" w:type="dxa"/>
+              <w:bottom w:w="120" w:type="dxa"/>
+              <w:right w:w="180" w:type="dxa"/>
+            </w:tcMar>
+            <w:vAlign w:val="center"/>
+            <w:hideMark/>
+          </w:tcPr>
+          <w:p>
+            <w:pPr>
+              <w:pStyle w:val="UMPParagraph"/>
+              <w:rPr>
+                <w:lang w:val="en-MY"/>
+              </w:rPr>
+            </w:pPr>
+            <w:r>
+              <w:rPr>
+                <w:lang w:val="en-MY"/>
+              </w:rPr>
+              <w:t>1 (Strongly Disagree)</w:t>
+            </w:r>
+          </w:p>
+        </w:tc>
+        <w:tc>
+          <w:tcPr>
+            <w:tcW w:w="0" w:type="auto"/>
+            <w:tcBorders>
+              <w:top w:val="single" w:sz="6" w:space="0" w:color="C4C7C5"/>
+              <w:left w:val="single" w:sz="6" w:space="0" w:color="C4C7C5"/>
+              <w:bottom w:val="single" w:sz="6" w:space="0" w:color="C4C7C5"/>
+              <w:right w:val="single" w:sz="6" w:space="0" w:color="C4C7C5"/>
+            </w:tcBorders>
+            <w:tcMar>
+              <w:top w:w="120" w:type="dxa"/>
+              <w:left w:w="180" w:type="dxa"/>
+              <w:bottom w:w="120" w:type="dxa"/>
+              <w:right w:w="180" w:type="dxa"/>
+            </w:tcMar>
+            <w:vAlign w:val="center"/>
+            <w:hideMark/>
+          </w:tcPr>
+          <w:p>
+            <w:pPr>
+              <w:pStyle w:val="UMPParagraph"/>
+              <w:rPr>
+                <w:lang w:val="en-MY"/>
+              </w:rPr>
+            </w:pPr>
+            <w:r>
+              <w:rPr>
+                <w:lang w:val="en-MY"/>
+              </w:rPr>
+              <w:t>2.9%</w:t>
+            </w:r>
+          </w:p>
+        </w:tc>
+        <w:tc>
+          <w:tcPr>
+            <w:tcW w:w="0" w:type="auto"/>
+            <w:tcBorders>
+              <w:top w:val="single" w:sz="6" w:space="0" w:color="C4C7C5"/>
+              <w:left w:val="single" w:sz="6" w:space="0" w:color="C4C7C5"/>
+              <w:bottom w:val="single" w:sz="6" w:space="0" w:color="C4C7C5"/>
+              <w:right w:val="single" w:sz="6" w:space="0" w:color="C4C7C5"/>
+            </w:tcBorders>
+            <w:tcMar>
+              <w:top w:w="120" w:type="dxa"/>
+              <w:left w:w="180" w:type="dxa"/>
+              <w:bottom w:w="120" w:type="dxa"/>
+              <w:right w:w="180" w:type="dxa"/>
+            </w:tcMar>
+            <w:vAlign w:val="center"/>
+            <w:hideMark/>
+          </w:tcPr>
+          <w:p>
+            <w:pPr>
+              <w:pStyle w:val="UMPParagraph"/>
+              <w:rPr>
+                <w:lang w:val="en-MY"/>
+              </w:rPr>
+            </w:pPr>
+            <w:r>
+              <w:rPr>
+                <w:lang w:val="en-MY"/>
+              </w:rPr>
+              <w:t>$n = 1$</w:t>
+            </w:r>
+          </w:p>
+        </w:tc>
+      </w:tr>
+    </w:tbl>
+    <w:p>
+      <w:pPr>
+        <w:pStyle w:val="UMPParagraph"/>
+        <w:rPr>
+          <w:lang w:val="en-MY"/>
+        </w:rPr>
+      </w:pPr>
+      <w:r>
+        <w:rPr>
+          <w:b/>
+          <w:bCs/>
+          <w:lang w:val="en-MY"/>
+        </w:rPr>
+        <w:t>Result Summary:</w:t>
+      </w:r>
+      <w:r>
+        <w:rPr>
+          <w:lang w:val="en-MY"/>
+        </w:rPr>
+        <w:t xml:space="preserve"> The real-time synchronization of the bulletin board achieved highly positive feedback, yielding a high mean score of </w:t>
+      </w:r>
+      <w:r>
+        <w:rPr>
+          <w:b/>
+          <w:bCs/>
+          <w:lang w:val="en-MY"/>
+        </w:rPr>
+        <w:t>4.15</w:t>
+      </w:r>
+      <w:r>
+        <w:rPr>
+          <w:lang w:val="en-MY"/>
+        </w:rPr>
+        <w:t xml:space="preserve">. This validates that the integration of the reactive frontend with the database architecture functions accurately and without processing delays. </w:t>
+      </w:r>
+    </w:p>
+    <w:p>
+      <w:pPr>
+        <w:pStyle w:val="UMPParagraph"/>
+        <w:rPr>
+          <w:lang w:val="en-MY"/>
+        </w:rPr>
+      </w:pPr>
+    </w:p>
+    <w:p>
+      <w:pPr>
+        <w:pStyle w:val="Heading2"/>
+        <w:rPr>
+          <w:lang w:val="en-MY"/>
+        </w:rPr>
+      </w:pPr>
+      <w:r>
+        <w:rPr>
+          <w:lang w:val="en-MY"/>
+        </w:rPr>
+        <w:lastRenderedPageBreak/>
+        <w:t>Discussion</w:t>
+      </w:r>
+    </w:p>
+    <w:p>
+      <w:pPr>
+        <w:pStyle w:val="UMPParagraph"/>
+        <w:rPr>
+          <w:lang w:val="en-MY"/>
+        </w:rPr>
+      </w:pPr>
+      <w:r>
+        <w:rPr>
+          <w:lang w:val="en-MY"/>
+        </w:rPr>
+        <w:t>The empirical data collected from the UAT survey confirms that all three primary project objectives have been successfully accomplished. Investigating stakeholder requirements highlighted that information fragmentation across unofficial social media streams severely limits health awareness on campus. NewsNow addresses this vulnerability by centralizing announcements into a single point of truth.  From an educational and operational perspective, translating clinical updates—such as mental health resources, clinic operational changes, and immunization drives—into dynamic content slots successfully bridges the communication gap between healthcare providers and students. The high performance recorded during user testing strongly aligns with established interactive system literature, validating that user-friendly digital layouts foster significantly better comprehension and responsiveness than static text displays.  However, an operational limitation was observed within the system architecture during evaluation. The current content posting module limits category assignments to a strict, pre-defined selection. While this structure protects database alignment and prevents index fragmentation within the backend, it restricts administrators from generating customized sub-categories for unique, temporary public health campaigns.</w:t>
+      </w:r>
+    </w:p>
+    <w:p>
+      <w:pPr>
+        <w:pStyle w:val="Heading2"/>
+        <w:rPr>
+          <w:lang w:val="en-MY"/>
+        </w:rPr>
+      </w:pPr>
+      <w:r>
+        <w:rPr>
+          <w:lang w:val="en-MY"/>
+        </w:rPr>
+        <w:t>Conclusion</w:t>
+      </w:r>
+    </w:p>
+    <w:p>
+      <w:pPr>
+        <w:pStyle w:val="UMPParagraph"/>
+        <w:rPr>
+          <w:lang w:val="en-MY"/>
+        </w:rPr>
+      </w:pPr>
+      <w:r>
+        <w:rPr>
+          <w:lang w:val="en-MY"/>
+        </w:rPr>
+        <w:t>In conclusion, this chapter presented the empirical quantitative testing data and associated discussion for the “NewsNow” Interactive PKU Bulletin Board system. The usability metrics fall squarely into the "very good" and "excellent" ranges, demonstrating that the user interface allows students to browse notices easily while empowering staff to manage records efficiently. Operationally, pre-test evaluations and post-test feedback indicated a substantial improvement in user information accessibility and health literacy. These positive findings prove the baseline efficacy of the software framework and establish a reliable foundation for the final conclusions and future architectural recommendations detailed in Chapter 5.</w:t>
+      </w:r>
+    </w:p>
+    <w:p>
+      <w:pPr>
+        <w:pStyle w:val="UMPParagraph"/>
+      </w:pPr>
+    </w:p>
+    <w:p>
+      <w:pPr>
+        <w:pStyle w:val="UMPParagraph"/>
+      </w:pPr>
+    </w:p>
+    <w:p>
+      <w:pPr>
+        <w:pStyle w:val="UMPParagraph"/>
+      </w:pPr>
     </w:p>
     <w:tbl>
       <w:tblPr>
@@ -17796,12 +18712,6 @@
           <w:lang w:val="en-MY"/>
         </w:rPr>
       </w:pPr>
-      <w:r>
-        <w:rPr>
-          <w:lang w:val="en-MY"/>
-        </w:rPr>
-        <w:br w:type="page"/>
-      </w:r>
     </w:p>
     <w:tbl>
       <w:tblPr>
@@ -17845,7 +18755,6 @@
                 <w:szCs w:val="36"/>
                 <w:lang w:val="en-MY" w:eastAsia="ja-JP"/>
               </w:rPr>
-              <w:lastRenderedPageBreak/>
               <w:t xml:space="preserve">Staff </w:t>
             </w:r>
             <w:r>
@@ -18550,30 +19459,30 @@
       <w:r>
         <w:br/>
       </w:r>
-      <w:bookmarkStart w:id="50" w:name="_Toc227920997"/>
+      <w:bookmarkStart w:id="49" w:name="_Toc227920997"/>
       <w:r>
         <w:t>CONCLUSION</w:t>
       </w:r>
+      <w:bookmarkEnd w:id="49"/>
+    </w:p>
+    <w:p>
+      <w:pPr>
+        <w:pStyle w:val="Heading2"/>
+      </w:pPr>
+      <w:bookmarkStart w:id="50" w:name="_Toc227920998"/>
+      <w:r>
+        <w:t>Introdu</w:t>
+      </w:r>
+      <w:r>
+        <w:t>c</w:t>
+      </w:r>
+      <w:r>
+        <w:t>tion</w:t>
+      </w:r>
       <w:bookmarkEnd w:id="50"/>
     </w:p>
     <w:p>
       <w:pPr>
-        <w:pStyle w:val="Heading2"/>
-      </w:pPr>
-      <w:bookmarkStart w:id="51" w:name="_Toc227920998"/>
-      <w:r>
-        <w:t>Introdu</w:t>
-      </w:r>
-      <w:r>
-        <w:t>c</w:t>
-      </w:r>
-      <w:r>
-        <w:t>tion</w:t>
-      </w:r>
-      <w:bookmarkEnd w:id="51"/>
-    </w:p>
-    <w:p>
-      <w:pPr>
         <w:pStyle w:val="UMPParagraph"/>
       </w:pPr>
       <w:r>
@@ -18602,7 +19511,15 @@
         <w:pStyle w:val="UMPParagraph"/>
       </w:pPr>
       <w:r>
-        <w:t>Testing results indicate that the major functionalities of the system, including user registration, login, logout, post management, and announcement viewing, were successfully implemented and operated as expected. The responsive design also ensures accessibility across various devices, supporting both desktop and mobile users. These outcomes demonstrate that the system is capable of improving information visibility, reducing communication barriers, and enhancing the overall effectiveness of health information dissemination within the university community.</w:t>
+        <w:t xml:space="preserve">Testing results indicate that the major functionalities of the system, including user registration, login, logout, post management, and announcement viewing, were successfully implemented and operated as expected. The responsive design also ensures accessibility across various devices, supporting both desktop and mobile users. These outcomes demonstrate that the system </w:t>
+      </w:r>
+      <w:proofErr w:type="gramStart"/>
+      <w:r>
+        <w:t>is capable of improving</w:t>
+      </w:r>
+      <w:proofErr w:type="gramEnd"/>
+      <w:r>
+        <w:t xml:space="preserve"> information visibility, reducing communication barriers, and enhancing the overall effectiveness of health information dissemination within the university community.</w:t>
       </w:r>
     </w:p>
     <w:p>
@@ -18622,7 +19539,18 @@
         <w:pStyle w:val="UMPParagraph"/>
       </w:pPr>
       <w:r>
-        <w:t>In conclusion, the NewsNow Interactive PKU Bulletin Board provides a practical and effective solution for modernizing communication between PKU and the UMPSA community. The project contributes towards the university's digital transformation efforts by delivering a centralized, accessible, and efficient platform that promotes health awareness and supports the dissemination of timely information to students and staff.</w:t>
+        <w:t xml:space="preserve">In conclusion, the NewsNow Interactive PKU Bulletin Board provides a practical and effective solution for modernizing communication between PKU and the UMPSA community. The project contributes towards the university's digital transformation efforts by delivering a centralized, accessible, and efficient platform that promotes health awareness and supports the dissemination of timely information to students </w:t>
+      </w:r>
+      <w:proofErr w:type="gramStart"/>
+      <w:r>
+        <w:t xml:space="preserve">and </w:t>
+      </w:r>
+      <w:r>
+        <w:t xml:space="preserve"> staffs</w:t>
+      </w:r>
+      <w:proofErr w:type="gramEnd"/>
+      <w:r>
+        <w:t>.</w:t>
       </w:r>
     </w:p>
     <w:p>
@@ -18638,6 +19566,510 @@
     </w:p>
     <w:p>
       <w:pPr>
+        <w:pStyle w:val="Heading2"/>
+        <w:rPr>
+          <w:rFonts w:eastAsia="Times New Roman"/>
+        </w:rPr>
+      </w:pPr>
+      <w:r>
+        <w:rPr>
+          <w:rFonts w:eastAsia="Times New Roman"/>
+        </w:rPr>
+        <w:lastRenderedPageBreak/>
+        <w:t>Summary of the Research</w:t>
+      </w:r>
+    </w:p>
+    <w:p>
+      <w:pPr>
+        <w:pStyle w:val="UMPParagraph"/>
+        <w:rPr>
+          <w:lang w:val="en-US"/>
+        </w:rPr>
+      </w:pPr>
+      <w:r>
+        <w:rPr>
+          <w:lang w:val="en-US"/>
+        </w:rPr>
+        <w:t>The core focus of this research was to design, implement, and evaluate an online bulletin board platform for the University Health Centre (PKU) to address the persistent challenges of fragmented health information dissemination and low notice visibility among university students. Traditional campus notification channels frequently rely on physical notice boards, irregular social media updates, or deeply nested web pages, which often fail to actively engage mobile-oriented students or deliver critical health updates timely.  To resolve this operational gap, an interactive digital bulletin application was engineered utilizing a frontend architecture built on HTML, React JS, and Tailwind CSS, reinforced by an agile backend data layer. The completed platform successfully simulates a centralized notification center, featuring dedicated content categories, real-time posting components, administrative dashboard operations, and filtering tools. Through structured web layout designs and immediate post validation, the system establishes an efficient and accessible environment where university students can securely consume certified health notices, thereby promoting proactive wellness behaviors across the campus community.</w:t>
+      </w:r>
+    </w:p>
+    <w:p>
+      <w:pPr>
+        <w:rPr>
+          <w:rFonts w:eastAsiaTheme="majorEastAsia" w:cstheme="majorBidi"/>
+          <w:b/>
+          <w:bCs/>
+          <w:sz w:val="24"/>
+          <w:szCs w:val="26"/>
+          <w:lang w:val="en-US"/>
+        </w:rPr>
+      </w:pPr>
+      <w:r>
+        <w:rPr>
+          <w:lang w:val="en-US"/>
+        </w:rPr>
+        <w:br w:type="page"/>
+      </w:r>
+    </w:p>
+    <w:p>
+      <w:pPr>
+        <w:pStyle w:val="Heading2"/>
+      </w:pPr>
+      <w:r>
+        <w:lastRenderedPageBreak/>
+        <w:t>Achievement of Research Objectives</w:t>
+      </w:r>
+    </w:p>
+    <w:p>
+      <w:pPr>
+        <w:pStyle w:val="UMPParagraph"/>
+        <w:rPr>
+          <w:lang w:val="en-US"/>
+        </w:rPr>
+      </w:pPr>
+      <w:r>
+        <w:rPr>
+          <w:lang w:val="en-US"/>
+        </w:rPr>
+        <w:t xml:space="preserve">The technical execution of this project successfully fulfilled all three core research objectives established at the initiation of the study:  </w:t>
+      </w:r>
+    </w:p>
+    <w:p>
+      <w:pPr>
+        <w:pStyle w:val="UMPParagraph"/>
+        <w:numPr>
+          <w:ilvl w:val="0"/>
+          <w:numId w:val="37"/>
+        </w:numPr>
+        <w:rPr>
+          <w:lang w:val="en-US"/>
+        </w:rPr>
+      </w:pPr>
+      <w:r>
+        <w:rPr>
+          <w:lang w:val="en-US"/>
+        </w:rPr>
+        <w:t xml:space="preserve">Objective 1: To investigate and document the specific needs of PKU staff and students regarding centralized health announcement features. Accomplished by conducting structured user requirement gathering sessions and clinical staff interviews. The empirical data collected directly informed the core functional design, identifying critical tracking requirements such as real-time updates and search capabilities.  </w:t>
+      </w:r>
+    </w:p>
+    <w:p>
+      <w:pPr>
+        <w:pStyle w:val="UMPParagraph"/>
+        <w:numPr>
+          <w:ilvl w:val="0"/>
+          <w:numId w:val="36"/>
+        </w:numPr>
+        <w:rPr>
+          <w:lang w:val="en-US"/>
+        </w:rPr>
+      </w:pPr>
+      <w:r>
+        <w:rPr>
+          <w:lang w:val="en-US"/>
+        </w:rPr>
+        <w:t xml:space="preserve">Objective 2: To design and develop a user-friendly, cross-platform web application for a PKU Health Bulletin Board. Achieved through the implementation of </w:t>
+      </w:r>
+      <w:proofErr w:type="gramStart"/>
+      <w:r>
+        <w:rPr>
+          <w:lang w:val="en-US"/>
+        </w:rPr>
+        <w:t>a responsive</w:t>
+      </w:r>
+      <w:proofErr w:type="gramEnd"/>
+      <w:r>
+        <w:rPr>
+          <w:lang w:val="en-US"/>
+        </w:rPr>
+        <w:t xml:space="preserve">, role-based web architecture using React JS and Tailwind CSS. The platform successfully translates administrative workflows into responsive interface components, allowing validated staff to publish updates securely while ensuring visual layout stability across desktop and mobile form factors.  </w:t>
+      </w:r>
+    </w:p>
+    <w:p>
+      <w:pPr>
+        <w:pStyle w:val="UMPParagraph"/>
+        <w:numPr>
+          <w:ilvl w:val="0"/>
+          <w:numId w:val="36"/>
+        </w:numPr>
+        <w:rPr>
+          <w:lang w:val="en-US"/>
+        </w:rPr>
+      </w:pPr>
+      <w:r>
+        <w:rPr>
+          <w:lang w:val="en-US"/>
+        </w:rPr>
+        <w:t>Objective 3: To evaluate the NewsNow Web App to ensure it is effective in delivering timely information and enhancing user accessibility. Validated by conducting a comparative User Acceptance Testing (UAT) survey with thirty-four (N=34) target university respondents. The developed platform systematically outperformed traditional communication methods across all measured usability parameters, securing an overall recommendation mean score of 3.88.</w:t>
+      </w:r>
+    </w:p>
+    <w:p>
+      <w:pPr>
+        <w:pStyle w:val="UMPParagraph"/>
+        <w:rPr>
+          <w:lang w:val="en-US"/>
+        </w:rPr>
+      </w:pPr>
+    </w:p>
+    <w:p>
+      <w:pPr>
+        <w:rPr>
+          <w:rFonts w:eastAsiaTheme="majorEastAsia" w:cstheme="majorBidi"/>
+          <w:b/>
+          <w:bCs/>
+          <w:sz w:val="24"/>
+          <w:szCs w:val="26"/>
+          <w:lang w:val="en-US"/>
+        </w:rPr>
+      </w:pPr>
+      <w:r>
+        <w:br w:type="page"/>
+      </w:r>
+    </w:p>
+    <w:p>
+      <w:pPr>
+        <w:pStyle w:val="Heading2"/>
+      </w:pPr>
+      <w:r>
+        <w:lastRenderedPageBreak/>
+        <w:t>Contributions to the study</w:t>
+      </w:r>
+    </w:p>
+    <w:p>
+      <w:pPr>
+        <w:pStyle w:val="UMPParagraph"/>
+        <w:rPr>
+          <w:lang w:val="en-US"/>
+        </w:rPr>
+      </w:pPr>
+      <w:r>
+        <w:rPr>
+          <w:lang w:val="en-US"/>
+        </w:rPr>
+        <w:t>This research delivers two distinct values to the academic and operational environment:</w:t>
+      </w:r>
+    </w:p>
+    <w:p>
+      <w:pPr>
+        <w:pStyle w:val="UMPParagraph"/>
+        <w:numPr>
+          <w:ilvl w:val="0"/>
+          <w:numId w:val="35"/>
+        </w:numPr>
+        <w:rPr>
+          <w:lang w:val="en-US"/>
+        </w:rPr>
+      </w:pPr>
+      <w:r>
+        <w:rPr>
+          <w:lang w:val="en-US"/>
+        </w:rPr>
+        <w:t xml:space="preserve">Practical </w:t>
+      </w:r>
+      <w:proofErr w:type="gramStart"/>
+      <w:r>
+        <w:rPr>
+          <w:lang w:val="en-US"/>
+        </w:rPr>
+        <w:t>Contribution</w:t>
+      </w:r>
+      <w:r>
+        <w:rPr>
+          <w:lang w:val="en-US"/>
+        </w:rPr>
+        <w:t xml:space="preserve"> which</w:t>
+      </w:r>
+      <w:proofErr w:type="gramEnd"/>
+      <w:r>
+        <w:rPr>
+          <w:lang w:val="en-US"/>
+        </w:rPr>
+        <w:t xml:space="preserve"> </w:t>
+      </w:r>
+      <w:r>
+        <w:rPr>
+          <w:lang w:val="en-US"/>
+        </w:rPr>
+        <w:t xml:space="preserve">provides the university health center and the campus community with an optimized, centralized, and entirely risk-free digital environment to access up-to-date health directives, scheduling changes, and emergency alerts, directly increasing public health literacy. </w:t>
+      </w:r>
+    </w:p>
+    <w:p>
+      <w:pPr>
+        <w:pStyle w:val="UMPParagraph"/>
+        <w:numPr>
+          <w:ilvl w:val="0"/>
+          <w:numId w:val="34"/>
+        </w:numPr>
+        <w:rPr>
+          <w:lang w:val="en-US"/>
+        </w:rPr>
+      </w:pPr>
+      <w:r>
+        <w:rPr>
+          <w:lang w:val="en-US"/>
+        </w:rPr>
+        <w:t>Technical Contribution</w:t>
+      </w:r>
+      <w:r>
+        <w:rPr>
+          <w:lang w:val="en-US"/>
+        </w:rPr>
+        <w:t xml:space="preserve"> which</w:t>
+      </w:r>
+      <w:r>
+        <w:rPr>
+          <w:lang w:val="en-US"/>
+        </w:rPr>
+        <w:t xml:space="preserve"> offers a verified web engineering design model demonstrating how lightweight frontend frameworks, combined with modern CSS utilities, can maintain high cross-platform performance and UI clarity while eliminating visual clutter for end-users.</w:t>
+      </w:r>
+    </w:p>
+    <w:p>
+      <w:pPr>
+        <w:pStyle w:val="UMPParagraph"/>
+        <w:rPr>
+          <w:lang w:val="en-US"/>
+        </w:rPr>
+      </w:pPr>
+    </w:p>
+    <w:p>
+      <w:pPr>
+        <w:pStyle w:val="Heading2"/>
+      </w:pPr>
+      <w:r>
+        <w:t>Limitations of the study</w:t>
+      </w:r>
+    </w:p>
+    <w:p>
+      <w:pPr>
+        <w:pStyle w:val="UMPParagraph"/>
+        <w:rPr>
+          <w:lang w:val="en-MY"/>
+        </w:rPr>
+      </w:pPr>
+      <w:r>
+        <w:rPr>
+          <w:lang w:val="en-MY"/>
+        </w:rPr>
+        <w:t xml:space="preserve">Despite fulfilling its structural design goals, two primary limitations were identified during the development and testing phases: </w:t>
+      </w:r>
+    </w:p>
+    <w:p>
+      <w:pPr>
+        <w:pStyle w:val="UMPParagraph"/>
+        <w:numPr>
+          <w:ilvl w:val="0"/>
+          <w:numId w:val="38"/>
+        </w:numPr>
+        <w:rPr>
+          <w:lang w:val="en-MY"/>
+        </w:rPr>
+      </w:pPr>
+      <w:r>
+        <w:rPr>
+          <w:b/>
+          <w:bCs/>
+          <w:lang w:val="en-MY"/>
+        </w:rPr>
+        <w:t>Functional Rigidity:</w:t>
+      </w:r>
+      <w:r>
+        <w:rPr>
+          <w:lang w:val="en-MY"/>
+        </w:rPr>
+        <w:t xml:space="preserve"> The current posting architecture restricts categorization to fixed binary or pre-determined labels, which prevents administrative staff from adjusting metadata structures or deploying highly customized tags for unexpected public health events. </w:t>
+      </w:r>
+    </w:p>
+    <w:p>
+      <w:pPr>
+        <w:pStyle w:val="UMPParagraph"/>
+        <w:numPr>
+          <w:ilvl w:val="0"/>
+          <w:numId w:val="38"/>
+        </w:numPr>
+        <w:rPr>
+          <w:lang w:val="en-MY"/>
+        </w:rPr>
+      </w:pPr>
+      <w:r>
+        <w:rPr>
+          <w:b/>
+          <w:bCs/>
+          <w:lang w:val="en-MY"/>
+        </w:rPr>
+        <w:t>Sample Localization:</w:t>
+      </w:r>
+      <w:r>
+        <w:rPr>
+          <w:lang w:val="en-MY"/>
+        </w:rPr>
+        <w:t xml:space="preserve"> The User Acceptance Testing evaluation was confined to a sample size of thirty-four ($N=34$) university participants. While statistically useful for baseline testing, this localized group does not fully reflect the diverse user </w:t>
+      </w:r>
+      <w:proofErr w:type="spellStart"/>
+      <w:r>
+        <w:rPr>
+          <w:lang w:val="en-MY"/>
+        </w:rPr>
+        <w:t>behaviors</w:t>
+      </w:r>
+      <w:proofErr w:type="spellEnd"/>
+      <w:r>
+        <w:rPr>
+          <w:lang w:val="en-MY"/>
+        </w:rPr>
+        <w:t xml:space="preserve"> and accessibility requirements of the broader university community across different regions and campuses. </w:t>
+      </w:r>
+    </w:p>
+    <w:p>
+      <w:pPr>
+        <w:rPr>
+          <w:rFonts w:eastAsiaTheme="majorEastAsia" w:cstheme="majorBidi"/>
+          <w:b/>
+          <w:bCs/>
+          <w:sz w:val="24"/>
+          <w:szCs w:val="26"/>
+          <w:lang w:val="en-US"/>
+        </w:rPr>
+      </w:pPr>
+      <w:r>
+        <w:br w:type="page"/>
+      </w:r>
+    </w:p>
+    <w:p>
+      <w:pPr>
+        <w:pStyle w:val="Heading2"/>
+      </w:pPr>
+      <w:proofErr w:type="spellStart"/>
+      <w:r>
+        <w:lastRenderedPageBreak/>
+        <w:t>Reccommendations</w:t>
+      </w:r>
+      <w:proofErr w:type="spellEnd"/>
+      <w:r>
+        <w:t xml:space="preserve"> for future work</w:t>
+      </w:r>
+    </w:p>
+    <w:p>
+      <w:pPr>
+        <w:pStyle w:val="UMPParagraph"/>
+        <w:rPr>
+          <w:lang w:val="en-MY"/>
+        </w:rPr>
+      </w:pPr>
+      <w:r>
+        <w:rPr>
+          <w:lang w:val="en-MY"/>
+        </w:rPr>
+        <w:t xml:space="preserve">To maximize the system’s operational performance, feature diversity, and community accessibility, the following future developments are recommended: </w:t>
+      </w:r>
+    </w:p>
+    <w:p>
+      <w:pPr>
+        <w:pStyle w:val="UMPParagraph"/>
+        <w:numPr>
+          <w:ilvl w:val="0"/>
+          <w:numId w:val="39"/>
+        </w:numPr>
+        <w:rPr>
+          <w:lang w:val="en-MY"/>
+        </w:rPr>
+      </w:pPr>
+      <w:r>
+        <w:rPr>
+          <w:b/>
+          <w:bCs/>
+          <w:lang w:val="en-MY"/>
+        </w:rPr>
+        <w:t>Native Mobile Porting:</w:t>
+      </w:r>
+      <w:r>
+        <w:rPr>
+          <w:lang w:val="en-MY"/>
+        </w:rPr>
+        <w:t xml:space="preserve"> The existing web framework should be packaged and optimized into standalone mobile applications for Android and iOS platforms to leverage native smartphone features such as push notifications and offline caching. </w:t>
+      </w:r>
+    </w:p>
+    <w:p>
+      <w:pPr>
+        <w:pStyle w:val="UMPParagraph"/>
+        <w:numPr>
+          <w:ilvl w:val="0"/>
+          <w:numId w:val="39"/>
+        </w:numPr>
+        <w:rPr>
+          <w:lang w:val="en-MY"/>
+        </w:rPr>
+      </w:pPr>
+      <w:r>
+        <w:rPr>
+          <w:b/>
+          <w:bCs/>
+          <w:lang w:val="en-MY"/>
+        </w:rPr>
+        <w:t>Functional Subsystem Integration:</w:t>
+      </w:r>
+      <w:r>
+        <w:rPr>
+          <w:lang w:val="en-MY"/>
+        </w:rPr>
+        <w:t xml:space="preserve"> The backend should be expanded to incorporate advanced operational capabilities, including real-time appointment booking, automated text alerts, and interactive public health consultation queues. </w:t>
+      </w:r>
+    </w:p>
+    <w:p>
+      <w:pPr>
+        <w:pStyle w:val="UMPParagraph"/>
+        <w:numPr>
+          <w:ilvl w:val="0"/>
+          <w:numId w:val="39"/>
+        </w:numPr>
+        <w:rPr>
+          <w:lang w:val="en-MY"/>
+        </w:rPr>
+      </w:pPr>
+      <w:r>
+        <w:rPr>
+          <w:b/>
+          <w:bCs/>
+          <w:lang w:val="en-MY"/>
+        </w:rPr>
+        <w:t>Large-Scale Multi-Campus Testing:</w:t>
+      </w:r>
+      <w:r>
+        <w:rPr>
+          <w:lang w:val="en-MY"/>
+        </w:rPr>
+        <w:t xml:space="preserve"> Future evaluation phases should expand the UAT survey scope to encompass a significantly larger and more geographically diverse user base across multiple university branches, gathering comprehensive data on system scalability and shifting user trends. </w:t>
+      </w:r>
+    </w:p>
+    <w:p>
+      <w:pPr>
+        <w:pStyle w:val="UMPParagraph"/>
+        <w:rPr>
+          <w:lang w:val="en-US"/>
+        </w:rPr>
+      </w:pPr>
+    </w:p>
+    <w:p>
+      <w:pPr>
+        <w:pStyle w:val="Heading2"/>
+      </w:pPr>
+      <w:proofErr w:type="gramStart"/>
+      <w:r>
+        <w:t>Final Conclusion</w:t>
+      </w:r>
+      <w:proofErr w:type="gramEnd"/>
+    </w:p>
+    <w:p>
+      <w:pPr>
+        <w:pStyle w:val="UMPParagraph"/>
+        <w:rPr>
+          <w:lang w:val="en-US"/>
+        </w:rPr>
+      </w:pPr>
+      <w:r>
+        <w:t>In conclusion, the developed Interactive PKU Bulletin Board (“NewsNow”) has successfully fulfilled all its research objectives and technical system design standards. The completion of this project demonstrates that combining modular, reactive web interfaces with structured content management design yields a highly effective educational and operational communication channel. By decisively outperforming traditional, fragmented communication methods in user acceptance, this software demonstrates how targeted web-based solutions can modernize information delivery, improve administrative workflows, and actively support the health and well-being of the university community.</w:t>
+      </w:r>
+    </w:p>
+    <w:p>
+      <w:pPr>
         <w:rPr>
           <w:rFonts w:eastAsia="Times New Roman" w:cs="Times New Roman"/>
           <w:b/>
@@ -18647,16 +20079,20 @@
           <w:lang w:val="en-US"/>
         </w:rPr>
       </w:pPr>
+      <w:bookmarkStart w:id="51" w:name="_Toc227920999"/>
+      <w:r>
+        <w:br w:type="page"/>
+      </w:r>
     </w:p>
     <w:p>
       <w:pPr>
         <w:pStyle w:val="REFERENCES"/>
       </w:pPr>
-      <w:bookmarkStart w:id="52" w:name="_Toc227920999"/>
-      <w:r>
+      <w:r>
+        <w:lastRenderedPageBreak/>
         <w:t>REFERENCE</w:t>
       </w:r>
-      <w:bookmarkEnd w:id="52"/>
+      <w:bookmarkEnd w:id="51"/>
     </w:p>
     <w:p>
       <w:pPr>
@@ -19483,9 +20919,158 @@
     </w:lvl>
   </w:abstractNum>
   <w:abstractNum w:abstractNumId="6" w15:restartNumberingAfterBreak="0">
-    <w:nsid w:val="3A396329"/>
+    <w:nsid w:val="2D490A39"/>
+    <w:multiLevelType w:val="multilevel"/>
+    <w:tmpl w:val="D12AF5EC"/>
+    <w:lvl w:ilvl="0">
+      <w:start w:val="1"/>
+      <w:numFmt w:val="bullet"/>
+      <w:lvlText w:val=""/>
+      <w:lvlJc w:val="left"/>
+      <w:pPr>
+        <w:tabs>
+          <w:tab w:val="num" w:pos="720"/>
+        </w:tabs>
+        <w:ind w:left="720" w:hanging="360"/>
+      </w:pPr>
+      <w:rPr>
+        <w:rFonts w:ascii="Symbol" w:hAnsi="Symbol" w:hint="default"/>
+        <w:sz w:val="20"/>
+      </w:rPr>
+    </w:lvl>
+    <w:lvl w:ilvl="1" w:tentative="1">
+      <w:start w:val="1"/>
+      <w:numFmt w:val="bullet"/>
+      <w:lvlText w:val="o"/>
+      <w:lvlJc w:val="left"/>
+      <w:pPr>
+        <w:tabs>
+          <w:tab w:val="num" w:pos="1440"/>
+        </w:tabs>
+        <w:ind w:left="1440" w:hanging="360"/>
+      </w:pPr>
+      <w:rPr>
+        <w:rFonts w:ascii="Courier New" w:hAnsi="Courier New" w:hint="default"/>
+        <w:sz w:val="20"/>
+      </w:rPr>
+    </w:lvl>
+    <w:lvl w:ilvl="2" w:tentative="1">
+      <w:start w:val="1"/>
+      <w:numFmt w:val="bullet"/>
+      <w:lvlText w:val=""/>
+      <w:lvlJc w:val="left"/>
+      <w:pPr>
+        <w:tabs>
+          <w:tab w:val="num" w:pos="2160"/>
+        </w:tabs>
+        <w:ind w:left="2160" w:hanging="360"/>
+      </w:pPr>
+      <w:rPr>
+        <w:rFonts w:ascii="Wingdings" w:hAnsi="Wingdings" w:hint="default"/>
+        <w:sz w:val="20"/>
+      </w:rPr>
+    </w:lvl>
+    <w:lvl w:ilvl="3" w:tentative="1">
+      <w:start w:val="1"/>
+      <w:numFmt w:val="bullet"/>
+      <w:lvlText w:val=""/>
+      <w:lvlJc w:val="left"/>
+      <w:pPr>
+        <w:tabs>
+          <w:tab w:val="num" w:pos="2880"/>
+        </w:tabs>
+        <w:ind w:left="2880" w:hanging="360"/>
+      </w:pPr>
+      <w:rPr>
+        <w:rFonts w:ascii="Wingdings" w:hAnsi="Wingdings" w:hint="default"/>
+        <w:sz w:val="20"/>
+      </w:rPr>
+    </w:lvl>
+    <w:lvl w:ilvl="4" w:tentative="1">
+      <w:start w:val="1"/>
+      <w:numFmt w:val="bullet"/>
+      <w:lvlText w:val=""/>
+      <w:lvlJc w:val="left"/>
+      <w:pPr>
+        <w:tabs>
+          <w:tab w:val="num" w:pos="3600"/>
+        </w:tabs>
+        <w:ind w:left="3600" w:hanging="360"/>
+      </w:pPr>
+      <w:rPr>
+        <w:rFonts w:ascii="Wingdings" w:hAnsi="Wingdings" w:hint="default"/>
+        <w:sz w:val="20"/>
+      </w:rPr>
+    </w:lvl>
+    <w:lvl w:ilvl="5" w:tentative="1">
+      <w:start w:val="1"/>
+      <w:numFmt w:val="bullet"/>
+      <w:lvlText w:val=""/>
+      <w:lvlJc w:val="left"/>
+      <w:pPr>
+        <w:tabs>
+          <w:tab w:val="num" w:pos="4320"/>
+        </w:tabs>
+        <w:ind w:left="4320" w:hanging="360"/>
+      </w:pPr>
+      <w:rPr>
+        <w:rFonts w:ascii="Wingdings" w:hAnsi="Wingdings" w:hint="default"/>
+        <w:sz w:val="20"/>
+      </w:rPr>
+    </w:lvl>
+    <w:lvl w:ilvl="6" w:tentative="1">
+      <w:start w:val="1"/>
+      <w:numFmt w:val="bullet"/>
+      <w:lvlText w:val=""/>
+      <w:lvlJc w:val="left"/>
+      <w:pPr>
+        <w:tabs>
+          <w:tab w:val="num" w:pos="5040"/>
+        </w:tabs>
+        <w:ind w:left="5040" w:hanging="360"/>
+      </w:pPr>
+      <w:rPr>
+        <w:rFonts w:ascii="Wingdings" w:hAnsi="Wingdings" w:hint="default"/>
+        <w:sz w:val="20"/>
+      </w:rPr>
+    </w:lvl>
+    <w:lvl w:ilvl="7" w:tentative="1">
+      <w:start w:val="1"/>
+      <w:numFmt w:val="bullet"/>
+      <w:lvlText w:val=""/>
+      <w:lvlJc w:val="left"/>
+      <w:pPr>
+        <w:tabs>
+          <w:tab w:val="num" w:pos="5760"/>
+        </w:tabs>
+        <w:ind w:left="5760" w:hanging="360"/>
+      </w:pPr>
+      <w:rPr>
+        <w:rFonts w:ascii="Wingdings" w:hAnsi="Wingdings" w:hint="default"/>
+        <w:sz w:val="20"/>
+      </w:rPr>
+    </w:lvl>
+    <w:lvl w:ilvl="8" w:tentative="1">
+      <w:start w:val="1"/>
+      <w:numFmt w:val="bullet"/>
+      <w:lvlText w:val=""/>
+      <w:lvlJc w:val="left"/>
+      <w:pPr>
+        <w:tabs>
+          <w:tab w:val="num" w:pos="6480"/>
+        </w:tabs>
+        <w:ind w:left="6480" w:hanging="360"/>
+      </w:pPr>
+      <w:rPr>
+        <w:rFonts w:ascii="Wingdings" w:hAnsi="Wingdings" w:hint="default"/>
+        <w:sz w:val="20"/>
+      </w:rPr>
+    </w:lvl>
+  </w:abstractNum>
+  <w:abstractNum w:abstractNumId="7" w15:restartNumberingAfterBreak="0">
+    <w:nsid w:val="30F85ED9"/>
     <w:multiLevelType w:val="hybridMultilevel"/>
-    <w:tmpl w:val="C4987E4C"/>
+    <w:tmpl w:val="0D305830"/>
     <w:lvl w:ilvl="0" w:tplc="44090001">
       <w:start w:val="1"/>
       <w:numFmt w:val="bullet"/>
@@ -19595,10 +21180,10 @@
       </w:rPr>
     </w:lvl>
   </w:abstractNum>
-  <w:abstractNum w:abstractNumId="7" w15:restartNumberingAfterBreak="0">
-    <w:nsid w:val="3D1F144E"/>
+  <w:abstractNum w:abstractNumId="8" w15:restartNumberingAfterBreak="0">
+    <w:nsid w:val="3A396329"/>
     <w:multiLevelType w:val="hybridMultilevel"/>
-    <w:tmpl w:val="5DA640C0"/>
+    <w:tmpl w:val="C4987E4C"/>
     <w:lvl w:ilvl="0" w:tplc="44090001">
       <w:start w:val="1"/>
       <w:numFmt w:val="bullet"/>
@@ -19708,7 +21293,269 @@
       </w:rPr>
     </w:lvl>
   </w:abstractNum>
-  <w:abstractNum w:abstractNumId="8" w15:restartNumberingAfterBreak="0">
+  <w:abstractNum w:abstractNumId="9" w15:restartNumberingAfterBreak="0">
+    <w:nsid w:val="3D1F144E"/>
+    <w:multiLevelType w:val="hybridMultilevel"/>
+    <w:tmpl w:val="5DA640C0"/>
+    <w:lvl w:ilvl="0" w:tplc="44090001">
+      <w:start w:val="1"/>
+      <w:numFmt w:val="bullet"/>
+      <w:lvlText w:val=""/>
+      <w:lvlJc w:val="left"/>
+      <w:pPr>
+        <w:ind w:left="720" w:hanging="360"/>
+      </w:pPr>
+      <w:rPr>
+        <w:rFonts w:ascii="Symbol" w:hAnsi="Symbol" w:hint="default"/>
+      </w:rPr>
+    </w:lvl>
+    <w:lvl w:ilvl="1" w:tplc="44090003" w:tentative="1">
+      <w:start w:val="1"/>
+      <w:numFmt w:val="bullet"/>
+      <w:lvlText w:val="o"/>
+      <w:lvlJc w:val="left"/>
+      <w:pPr>
+        <w:ind w:left="1440" w:hanging="360"/>
+      </w:pPr>
+      <w:rPr>
+        <w:rFonts w:ascii="Courier New" w:hAnsi="Courier New" w:cs="Courier New" w:hint="default"/>
+      </w:rPr>
+    </w:lvl>
+    <w:lvl w:ilvl="2" w:tplc="44090005" w:tentative="1">
+      <w:start w:val="1"/>
+      <w:numFmt w:val="bullet"/>
+      <w:lvlText w:val=""/>
+      <w:lvlJc w:val="left"/>
+      <w:pPr>
+        <w:ind w:left="2160" w:hanging="360"/>
+      </w:pPr>
+      <w:rPr>
+        <w:rFonts w:ascii="Wingdings" w:hAnsi="Wingdings" w:hint="default"/>
+      </w:rPr>
+    </w:lvl>
+    <w:lvl w:ilvl="3" w:tplc="44090001" w:tentative="1">
+      <w:start w:val="1"/>
+      <w:numFmt w:val="bullet"/>
+      <w:lvlText w:val=""/>
+      <w:lvlJc w:val="left"/>
+      <w:pPr>
+        <w:ind w:left="2880" w:hanging="360"/>
+      </w:pPr>
+      <w:rPr>
+        <w:rFonts w:ascii="Symbol" w:hAnsi="Symbol" w:hint="default"/>
+      </w:rPr>
+    </w:lvl>
+    <w:lvl w:ilvl="4" w:tplc="44090003" w:tentative="1">
+      <w:start w:val="1"/>
+      <w:numFmt w:val="bullet"/>
+      <w:lvlText w:val="o"/>
+      <w:lvlJc w:val="left"/>
+      <w:pPr>
+        <w:ind w:left="3600" w:hanging="360"/>
+      </w:pPr>
+      <w:rPr>
+        <w:rFonts w:ascii="Courier New" w:hAnsi="Courier New" w:cs="Courier New" w:hint="default"/>
+      </w:rPr>
+    </w:lvl>
+    <w:lvl w:ilvl="5" w:tplc="44090005" w:tentative="1">
+      <w:start w:val="1"/>
+      <w:numFmt w:val="bullet"/>
+      <w:lvlText w:val=""/>
+      <w:lvlJc w:val="left"/>
+      <w:pPr>
+        <w:ind w:left="4320" w:hanging="360"/>
+      </w:pPr>
+      <w:rPr>
+        <w:rFonts w:ascii="Wingdings" w:hAnsi="Wingdings" w:hint="default"/>
+      </w:rPr>
+    </w:lvl>
+    <w:lvl w:ilvl="6" w:tplc="44090001" w:tentative="1">
+      <w:start w:val="1"/>
+      <w:numFmt w:val="bullet"/>
+      <w:lvlText w:val=""/>
+      <w:lvlJc w:val="left"/>
+      <w:pPr>
+        <w:ind w:left="5040" w:hanging="360"/>
+      </w:pPr>
+      <w:rPr>
+        <w:rFonts w:ascii="Symbol" w:hAnsi="Symbol" w:hint="default"/>
+      </w:rPr>
+    </w:lvl>
+    <w:lvl w:ilvl="7" w:tplc="44090003" w:tentative="1">
+      <w:start w:val="1"/>
+      <w:numFmt w:val="bullet"/>
+      <w:lvlText w:val="o"/>
+      <w:lvlJc w:val="left"/>
+      <w:pPr>
+        <w:ind w:left="5760" w:hanging="360"/>
+      </w:pPr>
+      <w:rPr>
+        <w:rFonts w:ascii="Courier New" w:hAnsi="Courier New" w:cs="Courier New" w:hint="default"/>
+      </w:rPr>
+    </w:lvl>
+    <w:lvl w:ilvl="8" w:tplc="44090005" w:tentative="1">
+      <w:start w:val="1"/>
+      <w:numFmt w:val="bullet"/>
+      <w:lvlText w:val=""/>
+      <w:lvlJc w:val="left"/>
+      <w:pPr>
+        <w:ind w:left="6480" w:hanging="360"/>
+      </w:pPr>
+      <w:rPr>
+        <w:rFonts w:ascii="Wingdings" w:hAnsi="Wingdings" w:hint="default"/>
+      </w:rPr>
+    </w:lvl>
+  </w:abstractNum>
+  <w:abstractNum w:abstractNumId="10" w15:restartNumberingAfterBreak="0">
+    <w:nsid w:val="47D217B4"/>
+    <w:multiLevelType w:val="multilevel"/>
+    <w:tmpl w:val="2D884512"/>
+    <w:lvl w:ilvl="0">
+      <w:start w:val="1"/>
+      <w:numFmt w:val="bullet"/>
+      <w:lvlText w:val=""/>
+      <w:lvlJc w:val="left"/>
+      <w:pPr>
+        <w:tabs>
+          <w:tab w:val="num" w:pos="720"/>
+        </w:tabs>
+        <w:ind w:left="720" w:hanging="360"/>
+      </w:pPr>
+      <w:rPr>
+        <w:rFonts w:ascii="Symbol" w:hAnsi="Symbol" w:hint="default"/>
+        <w:sz w:val="20"/>
+      </w:rPr>
+    </w:lvl>
+    <w:lvl w:ilvl="1" w:tentative="1">
+      <w:start w:val="1"/>
+      <w:numFmt w:val="bullet"/>
+      <w:lvlText w:val="o"/>
+      <w:lvlJc w:val="left"/>
+      <w:pPr>
+        <w:tabs>
+          <w:tab w:val="num" w:pos="1440"/>
+        </w:tabs>
+        <w:ind w:left="1440" w:hanging="360"/>
+      </w:pPr>
+      <w:rPr>
+        <w:rFonts w:ascii="Courier New" w:hAnsi="Courier New" w:hint="default"/>
+        <w:sz w:val="20"/>
+      </w:rPr>
+    </w:lvl>
+    <w:lvl w:ilvl="2" w:tentative="1">
+      <w:start w:val="1"/>
+      <w:numFmt w:val="bullet"/>
+      <w:lvlText w:val=""/>
+      <w:lvlJc w:val="left"/>
+      <w:pPr>
+        <w:tabs>
+          <w:tab w:val="num" w:pos="2160"/>
+        </w:tabs>
+        <w:ind w:left="2160" w:hanging="360"/>
+      </w:pPr>
+      <w:rPr>
+        <w:rFonts w:ascii="Wingdings" w:hAnsi="Wingdings" w:hint="default"/>
+        <w:sz w:val="20"/>
+      </w:rPr>
+    </w:lvl>
+    <w:lvl w:ilvl="3" w:tentative="1">
+      <w:start w:val="1"/>
+      <w:numFmt w:val="bullet"/>
+      <w:lvlText w:val=""/>
+      <w:lvlJc w:val="left"/>
+      <w:pPr>
+        <w:tabs>
+          <w:tab w:val="num" w:pos="2880"/>
+        </w:tabs>
+        <w:ind w:left="2880" w:hanging="360"/>
+      </w:pPr>
+      <w:rPr>
+        <w:rFonts w:ascii="Wingdings" w:hAnsi="Wingdings" w:hint="default"/>
+        <w:sz w:val="20"/>
+      </w:rPr>
+    </w:lvl>
+    <w:lvl w:ilvl="4" w:tentative="1">
+      <w:start w:val="1"/>
+      <w:numFmt w:val="bullet"/>
+      <w:lvlText w:val=""/>
+      <w:lvlJc w:val="left"/>
+      <w:pPr>
+        <w:tabs>
+          <w:tab w:val="num" w:pos="3600"/>
+        </w:tabs>
+        <w:ind w:left="3600" w:hanging="360"/>
+      </w:pPr>
+      <w:rPr>
+        <w:rFonts w:ascii="Wingdings" w:hAnsi="Wingdings" w:hint="default"/>
+        <w:sz w:val="20"/>
+      </w:rPr>
+    </w:lvl>
+    <w:lvl w:ilvl="5" w:tentative="1">
+      <w:start w:val="1"/>
+      <w:numFmt w:val="bullet"/>
+      <w:lvlText w:val=""/>
+      <w:lvlJc w:val="left"/>
+      <w:pPr>
+        <w:tabs>
+          <w:tab w:val="num" w:pos="4320"/>
+        </w:tabs>
+        <w:ind w:left="4320" w:hanging="360"/>
+      </w:pPr>
+      <w:rPr>
+        <w:rFonts w:ascii="Wingdings" w:hAnsi="Wingdings" w:hint="default"/>
+        <w:sz w:val="20"/>
+      </w:rPr>
+    </w:lvl>
+    <w:lvl w:ilvl="6" w:tentative="1">
+      <w:start w:val="1"/>
+      <w:numFmt w:val="bullet"/>
+      <w:lvlText w:val=""/>
+      <w:lvlJc w:val="left"/>
+      <w:pPr>
+        <w:tabs>
+          <w:tab w:val="num" w:pos="5040"/>
+        </w:tabs>
+        <w:ind w:left="5040" w:hanging="360"/>
+      </w:pPr>
+      <w:rPr>
+        <w:rFonts w:ascii="Wingdings" w:hAnsi="Wingdings" w:hint="default"/>
+        <w:sz w:val="20"/>
+      </w:rPr>
+    </w:lvl>
+    <w:lvl w:ilvl="7" w:tentative="1">
+      <w:start w:val="1"/>
+      <w:numFmt w:val="bullet"/>
+      <w:lvlText w:val=""/>
+      <w:lvlJc w:val="left"/>
+      <w:pPr>
+        <w:tabs>
+          <w:tab w:val="num" w:pos="5760"/>
+        </w:tabs>
+        <w:ind w:left="5760" w:hanging="360"/>
+      </w:pPr>
+      <w:rPr>
+        <w:rFonts w:ascii="Wingdings" w:hAnsi="Wingdings" w:hint="default"/>
+        <w:sz w:val="20"/>
+      </w:rPr>
+    </w:lvl>
+    <w:lvl w:ilvl="8" w:tentative="1">
+      <w:start w:val="1"/>
+      <w:numFmt w:val="bullet"/>
+      <w:lvlText w:val=""/>
+      <w:lvlJc w:val="left"/>
+      <w:pPr>
+        <w:tabs>
+          <w:tab w:val="num" w:pos="6480"/>
+        </w:tabs>
+        <w:ind w:left="6480" w:hanging="360"/>
+      </w:pPr>
+      <w:rPr>
+        <w:rFonts w:ascii="Wingdings" w:hAnsi="Wingdings" w:hint="default"/>
+        <w:sz w:val="20"/>
+      </w:rPr>
+    </w:lvl>
+  </w:abstractNum>
+  <w:abstractNum w:abstractNumId="11" w15:restartNumberingAfterBreak="0">
     <w:nsid w:val="488E4532"/>
     <w:multiLevelType w:val="multilevel"/>
     <w:tmpl w:val="B60A2664"/>
@@ -19821,7 +21668,7 @@
       </w:rPr>
     </w:lvl>
   </w:abstractNum>
-  <w:abstractNum w:abstractNumId="9" w15:restartNumberingAfterBreak="0">
+  <w:abstractNum w:abstractNumId="12" w15:restartNumberingAfterBreak="0">
     <w:nsid w:val="56F2448D"/>
     <w:multiLevelType w:val="hybridMultilevel"/>
     <w:tmpl w:val="010C63E8"/>
@@ -19933,10 +21780,10 @@
       </w:rPr>
     </w:lvl>
   </w:abstractNum>
-  <w:abstractNum w:abstractNumId="10" w15:restartNumberingAfterBreak="0">
-    <w:nsid w:val="5CB41EB2"/>
+  <w:abstractNum w:abstractNumId="13" w15:restartNumberingAfterBreak="0">
+    <w:nsid w:val="5B290651"/>
     <w:multiLevelType w:val="hybridMultilevel"/>
-    <w:tmpl w:val="8BA84756"/>
+    <w:tmpl w:val="151A0B44"/>
     <w:lvl w:ilvl="0" w:tplc="44090001">
       <w:start w:val="1"/>
       <w:numFmt w:val="bullet"/>
@@ -20046,7 +21893,120 @@
       </w:rPr>
     </w:lvl>
   </w:abstractNum>
-  <w:abstractNum w:abstractNumId="11" w15:restartNumberingAfterBreak="0">
+  <w:abstractNum w:abstractNumId="14" w15:restartNumberingAfterBreak="0">
+    <w:nsid w:val="5CB41EB2"/>
+    <w:multiLevelType w:val="hybridMultilevel"/>
+    <w:tmpl w:val="8BA84756"/>
+    <w:lvl w:ilvl="0" w:tplc="44090001">
+      <w:start w:val="1"/>
+      <w:numFmt w:val="bullet"/>
+      <w:lvlText w:val=""/>
+      <w:lvlJc w:val="left"/>
+      <w:pPr>
+        <w:ind w:left="720" w:hanging="360"/>
+      </w:pPr>
+      <w:rPr>
+        <w:rFonts w:ascii="Symbol" w:hAnsi="Symbol" w:hint="default"/>
+      </w:rPr>
+    </w:lvl>
+    <w:lvl w:ilvl="1" w:tplc="44090003" w:tentative="1">
+      <w:start w:val="1"/>
+      <w:numFmt w:val="bullet"/>
+      <w:lvlText w:val="o"/>
+      <w:lvlJc w:val="left"/>
+      <w:pPr>
+        <w:ind w:left="1440" w:hanging="360"/>
+      </w:pPr>
+      <w:rPr>
+        <w:rFonts w:ascii="Courier New" w:hAnsi="Courier New" w:cs="Courier New" w:hint="default"/>
+      </w:rPr>
+    </w:lvl>
+    <w:lvl w:ilvl="2" w:tplc="44090005" w:tentative="1">
+      <w:start w:val="1"/>
+      <w:numFmt w:val="bullet"/>
+      <w:lvlText w:val=""/>
+      <w:lvlJc w:val="left"/>
+      <w:pPr>
+        <w:ind w:left="2160" w:hanging="360"/>
+      </w:pPr>
+      <w:rPr>
+        <w:rFonts w:ascii="Wingdings" w:hAnsi="Wingdings" w:hint="default"/>
+      </w:rPr>
+    </w:lvl>
+    <w:lvl w:ilvl="3" w:tplc="44090001" w:tentative="1">
+      <w:start w:val="1"/>
+      <w:numFmt w:val="bullet"/>
+      <w:lvlText w:val=""/>
+      <w:lvlJc w:val="left"/>
+      <w:pPr>
+        <w:ind w:left="2880" w:hanging="360"/>
+      </w:pPr>
+      <w:rPr>
+        <w:rFonts w:ascii="Symbol" w:hAnsi="Symbol" w:hint="default"/>
+      </w:rPr>
+    </w:lvl>
+    <w:lvl w:ilvl="4" w:tplc="44090003" w:tentative="1">
+      <w:start w:val="1"/>
+      <w:numFmt w:val="bullet"/>
+      <w:lvlText w:val="o"/>
+      <w:lvlJc w:val="left"/>
+      <w:pPr>
+        <w:ind w:left="3600" w:hanging="360"/>
+      </w:pPr>
+      <w:rPr>
+        <w:rFonts w:ascii="Courier New" w:hAnsi="Courier New" w:cs="Courier New" w:hint="default"/>
+      </w:rPr>
+    </w:lvl>
+    <w:lvl w:ilvl="5" w:tplc="44090005" w:tentative="1">
+      <w:start w:val="1"/>
+      <w:numFmt w:val="bullet"/>
+      <w:lvlText w:val=""/>
+      <w:lvlJc w:val="left"/>
+      <w:pPr>
+        <w:ind w:left="4320" w:hanging="360"/>
+      </w:pPr>
+      <w:rPr>
+        <w:rFonts w:ascii="Wingdings" w:hAnsi="Wingdings" w:hint="default"/>
+      </w:rPr>
+    </w:lvl>
+    <w:lvl w:ilvl="6" w:tplc="44090001" w:tentative="1">
+      <w:start w:val="1"/>
+      <w:numFmt w:val="bullet"/>
+      <w:lvlText w:val=""/>
+      <w:lvlJc w:val="left"/>
+      <w:pPr>
+        <w:ind w:left="5040" w:hanging="360"/>
+      </w:pPr>
+      <w:rPr>
+        <w:rFonts w:ascii="Symbol" w:hAnsi="Symbol" w:hint="default"/>
+      </w:rPr>
+    </w:lvl>
+    <w:lvl w:ilvl="7" w:tplc="44090003" w:tentative="1">
+      <w:start w:val="1"/>
+      <w:numFmt w:val="bullet"/>
+      <w:lvlText w:val="o"/>
+      <w:lvlJc w:val="left"/>
+      <w:pPr>
+        <w:ind w:left="5760" w:hanging="360"/>
+      </w:pPr>
+      <w:rPr>
+        <w:rFonts w:ascii="Courier New" w:hAnsi="Courier New" w:cs="Courier New" w:hint="default"/>
+      </w:rPr>
+    </w:lvl>
+    <w:lvl w:ilvl="8" w:tplc="44090005" w:tentative="1">
+      <w:start w:val="1"/>
+      <w:numFmt w:val="bullet"/>
+      <w:lvlText w:val=""/>
+      <w:lvlJc w:val="left"/>
+      <w:pPr>
+        <w:ind w:left="6480" w:hanging="360"/>
+      </w:pPr>
+      <w:rPr>
+        <w:rFonts w:ascii="Wingdings" w:hAnsi="Wingdings" w:hint="default"/>
+      </w:rPr>
+    </w:lvl>
+  </w:abstractNum>
+  <w:abstractNum w:abstractNumId="15" w15:restartNumberingAfterBreak="0">
     <w:nsid w:val="61205763"/>
     <w:multiLevelType w:val="hybridMultilevel"/>
     <w:tmpl w:val="1B6437E4"/>
@@ -20136,10 +22096,10 @@
       </w:pPr>
     </w:lvl>
   </w:abstractNum>
-  <w:abstractNum w:abstractNumId="12" w15:restartNumberingAfterBreak="0">
+  <w:abstractNum w:abstractNumId="16" w15:restartNumberingAfterBreak="0">
     <w:nsid w:val="63BA2DFB"/>
     <w:multiLevelType w:val="multilevel"/>
-    <w:tmpl w:val="6DC6E2EE"/>
+    <w:tmpl w:val="79B0CED0"/>
     <w:lvl w:ilvl="0">
       <w:start w:val="1"/>
       <w:numFmt w:val="decimal"/>
@@ -20259,7 +22219,120 @@
       </w:rPr>
     </w:lvl>
   </w:abstractNum>
-  <w:abstractNum w:abstractNumId="13" w15:restartNumberingAfterBreak="0">
+  <w:abstractNum w:abstractNumId="17" w15:restartNumberingAfterBreak="0">
+    <w:nsid w:val="63D40F5F"/>
+    <w:multiLevelType w:val="hybridMultilevel"/>
+    <w:tmpl w:val="E74AAC6E"/>
+    <w:lvl w:ilvl="0" w:tplc="44090001">
+      <w:start w:val="1"/>
+      <w:numFmt w:val="bullet"/>
+      <w:lvlText w:val=""/>
+      <w:lvlJc w:val="left"/>
+      <w:pPr>
+        <w:ind w:left="720" w:hanging="360"/>
+      </w:pPr>
+      <w:rPr>
+        <w:rFonts w:ascii="Symbol" w:hAnsi="Symbol" w:hint="default"/>
+      </w:rPr>
+    </w:lvl>
+    <w:lvl w:ilvl="1" w:tplc="44090003" w:tentative="1">
+      <w:start w:val="1"/>
+      <w:numFmt w:val="bullet"/>
+      <w:lvlText w:val="o"/>
+      <w:lvlJc w:val="left"/>
+      <w:pPr>
+        <w:ind w:left="1440" w:hanging="360"/>
+      </w:pPr>
+      <w:rPr>
+        <w:rFonts w:ascii="Courier New" w:hAnsi="Courier New" w:cs="Courier New" w:hint="default"/>
+      </w:rPr>
+    </w:lvl>
+    <w:lvl w:ilvl="2" w:tplc="44090005" w:tentative="1">
+      <w:start w:val="1"/>
+      <w:numFmt w:val="bullet"/>
+      <w:lvlText w:val=""/>
+      <w:lvlJc w:val="left"/>
+      <w:pPr>
+        <w:ind w:left="2160" w:hanging="360"/>
+      </w:pPr>
+      <w:rPr>
+        <w:rFonts w:ascii="Wingdings" w:hAnsi="Wingdings" w:hint="default"/>
+      </w:rPr>
+    </w:lvl>
+    <w:lvl w:ilvl="3" w:tplc="44090001" w:tentative="1">
+      <w:start w:val="1"/>
+      <w:numFmt w:val="bullet"/>
+      <w:lvlText w:val=""/>
+      <w:lvlJc w:val="left"/>
+      <w:pPr>
+        <w:ind w:left="2880" w:hanging="360"/>
+      </w:pPr>
+      <w:rPr>
+        <w:rFonts w:ascii="Symbol" w:hAnsi="Symbol" w:hint="default"/>
+      </w:rPr>
+    </w:lvl>
+    <w:lvl w:ilvl="4" w:tplc="44090003" w:tentative="1">
+      <w:start w:val="1"/>
+      <w:numFmt w:val="bullet"/>
+      <w:lvlText w:val="o"/>
+      <w:lvlJc w:val="left"/>
+      <w:pPr>
+        <w:ind w:left="3600" w:hanging="360"/>
+      </w:pPr>
+      <w:rPr>
+        <w:rFonts w:ascii="Courier New" w:hAnsi="Courier New" w:cs="Courier New" w:hint="default"/>
+      </w:rPr>
+    </w:lvl>
+    <w:lvl w:ilvl="5" w:tplc="44090005" w:tentative="1">
+      <w:start w:val="1"/>
+      <w:numFmt w:val="bullet"/>
+      <w:lvlText w:val=""/>
+      <w:lvlJc w:val="left"/>
+      <w:pPr>
+        <w:ind w:left="4320" w:hanging="360"/>
+      </w:pPr>
+      <w:rPr>
+        <w:rFonts w:ascii="Wingdings" w:hAnsi="Wingdings" w:hint="default"/>
+      </w:rPr>
+    </w:lvl>
+    <w:lvl w:ilvl="6" w:tplc="44090001" w:tentative="1">
+      <w:start w:val="1"/>
+      <w:numFmt w:val="bullet"/>
+      <w:lvlText w:val=""/>
+      <w:lvlJc w:val="left"/>
+      <w:pPr>
+        <w:ind w:left="5040" w:hanging="360"/>
+      </w:pPr>
+      <w:rPr>
+        <w:rFonts w:ascii="Symbol" w:hAnsi="Symbol" w:hint="default"/>
+      </w:rPr>
+    </w:lvl>
+    <w:lvl w:ilvl="7" w:tplc="44090003" w:tentative="1">
+      <w:start w:val="1"/>
+      <w:numFmt w:val="bullet"/>
+      <w:lvlText w:val="o"/>
+      <w:lvlJc w:val="left"/>
+      <w:pPr>
+        <w:ind w:left="5760" w:hanging="360"/>
+      </w:pPr>
+      <w:rPr>
+        <w:rFonts w:ascii="Courier New" w:hAnsi="Courier New" w:cs="Courier New" w:hint="default"/>
+      </w:rPr>
+    </w:lvl>
+    <w:lvl w:ilvl="8" w:tplc="44090005" w:tentative="1">
+      <w:start w:val="1"/>
+      <w:numFmt w:val="bullet"/>
+      <w:lvlText w:val=""/>
+      <w:lvlJc w:val="left"/>
+      <w:pPr>
+        <w:ind w:left="6480" w:hanging="360"/>
+      </w:pPr>
+      <w:rPr>
+        <w:rFonts w:ascii="Wingdings" w:hAnsi="Wingdings" w:hint="default"/>
+      </w:rPr>
+    </w:lvl>
+  </w:abstractNum>
+  <w:abstractNum w:abstractNumId="18" w15:restartNumberingAfterBreak="0">
     <w:nsid w:val="66A0555B"/>
     <w:multiLevelType w:val="multilevel"/>
     <w:tmpl w:val="43101498"/>
@@ -20372,7 +22445,269 @@
       </w:rPr>
     </w:lvl>
   </w:abstractNum>
-  <w:abstractNum w:abstractNumId="14" w15:restartNumberingAfterBreak="0">
+  <w:abstractNum w:abstractNumId="19" w15:restartNumberingAfterBreak="0">
+    <w:nsid w:val="682061DE"/>
+    <w:multiLevelType w:val="hybridMultilevel"/>
+    <w:tmpl w:val="92FAEB04"/>
+    <w:lvl w:ilvl="0" w:tplc="44090001">
+      <w:start w:val="1"/>
+      <w:numFmt w:val="bullet"/>
+      <w:lvlText w:val=""/>
+      <w:lvlJc w:val="left"/>
+      <w:pPr>
+        <w:ind w:left="720" w:hanging="360"/>
+      </w:pPr>
+      <w:rPr>
+        <w:rFonts w:ascii="Symbol" w:hAnsi="Symbol" w:hint="default"/>
+      </w:rPr>
+    </w:lvl>
+    <w:lvl w:ilvl="1" w:tplc="44090003" w:tentative="1">
+      <w:start w:val="1"/>
+      <w:numFmt w:val="bullet"/>
+      <w:lvlText w:val="o"/>
+      <w:lvlJc w:val="left"/>
+      <w:pPr>
+        <w:ind w:left="1440" w:hanging="360"/>
+      </w:pPr>
+      <w:rPr>
+        <w:rFonts w:ascii="Courier New" w:hAnsi="Courier New" w:cs="Courier New" w:hint="default"/>
+      </w:rPr>
+    </w:lvl>
+    <w:lvl w:ilvl="2" w:tplc="44090005" w:tentative="1">
+      <w:start w:val="1"/>
+      <w:numFmt w:val="bullet"/>
+      <w:lvlText w:val=""/>
+      <w:lvlJc w:val="left"/>
+      <w:pPr>
+        <w:ind w:left="2160" w:hanging="360"/>
+      </w:pPr>
+      <w:rPr>
+        <w:rFonts w:ascii="Wingdings" w:hAnsi="Wingdings" w:hint="default"/>
+      </w:rPr>
+    </w:lvl>
+    <w:lvl w:ilvl="3" w:tplc="44090001" w:tentative="1">
+      <w:start w:val="1"/>
+      <w:numFmt w:val="bullet"/>
+      <w:lvlText w:val=""/>
+      <w:lvlJc w:val="left"/>
+      <w:pPr>
+        <w:ind w:left="2880" w:hanging="360"/>
+      </w:pPr>
+      <w:rPr>
+        <w:rFonts w:ascii="Symbol" w:hAnsi="Symbol" w:hint="default"/>
+      </w:rPr>
+    </w:lvl>
+    <w:lvl w:ilvl="4" w:tplc="44090003" w:tentative="1">
+      <w:start w:val="1"/>
+      <w:numFmt w:val="bullet"/>
+      <w:lvlText w:val="o"/>
+      <w:lvlJc w:val="left"/>
+      <w:pPr>
+        <w:ind w:left="3600" w:hanging="360"/>
+      </w:pPr>
+      <w:rPr>
+        <w:rFonts w:ascii="Courier New" w:hAnsi="Courier New" w:cs="Courier New" w:hint="default"/>
+      </w:rPr>
+    </w:lvl>
+    <w:lvl w:ilvl="5" w:tplc="44090005" w:tentative="1">
+      <w:start w:val="1"/>
+      <w:numFmt w:val="bullet"/>
+      <w:lvlText w:val=""/>
+      <w:lvlJc w:val="left"/>
+      <w:pPr>
+        <w:ind w:left="4320" w:hanging="360"/>
+      </w:pPr>
+      <w:rPr>
+        <w:rFonts w:ascii="Wingdings" w:hAnsi="Wingdings" w:hint="default"/>
+      </w:rPr>
+    </w:lvl>
+    <w:lvl w:ilvl="6" w:tplc="44090001" w:tentative="1">
+      <w:start w:val="1"/>
+      <w:numFmt w:val="bullet"/>
+      <w:lvlText w:val=""/>
+      <w:lvlJc w:val="left"/>
+      <w:pPr>
+        <w:ind w:left="5040" w:hanging="360"/>
+      </w:pPr>
+      <w:rPr>
+        <w:rFonts w:ascii="Symbol" w:hAnsi="Symbol" w:hint="default"/>
+      </w:rPr>
+    </w:lvl>
+    <w:lvl w:ilvl="7" w:tplc="44090003" w:tentative="1">
+      <w:start w:val="1"/>
+      <w:numFmt w:val="bullet"/>
+      <w:lvlText w:val="o"/>
+      <w:lvlJc w:val="left"/>
+      <w:pPr>
+        <w:ind w:left="5760" w:hanging="360"/>
+      </w:pPr>
+      <w:rPr>
+        <w:rFonts w:ascii="Courier New" w:hAnsi="Courier New" w:cs="Courier New" w:hint="default"/>
+      </w:rPr>
+    </w:lvl>
+    <w:lvl w:ilvl="8" w:tplc="44090005" w:tentative="1">
+      <w:start w:val="1"/>
+      <w:numFmt w:val="bullet"/>
+      <w:lvlText w:val=""/>
+      <w:lvlJc w:val="left"/>
+      <w:pPr>
+        <w:ind w:left="6480" w:hanging="360"/>
+      </w:pPr>
+      <w:rPr>
+        <w:rFonts w:ascii="Wingdings" w:hAnsi="Wingdings" w:hint="default"/>
+      </w:rPr>
+    </w:lvl>
+  </w:abstractNum>
+  <w:abstractNum w:abstractNumId="20" w15:restartNumberingAfterBreak="0">
+    <w:nsid w:val="6D6878CE"/>
+    <w:multiLevelType w:val="multilevel"/>
+    <w:tmpl w:val="71AEA452"/>
+    <w:lvl w:ilvl="0">
+      <w:start w:val="1"/>
+      <w:numFmt w:val="bullet"/>
+      <w:lvlText w:val=""/>
+      <w:lvlJc w:val="left"/>
+      <w:pPr>
+        <w:tabs>
+          <w:tab w:val="num" w:pos="720"/>
+        </w:tabs>
+        <w:ind w:left="720" w:hanging="360"/>
+      </w:pPr>
+      <w:rPr>
+        <w:rFonts w:ascii="Symbol" w:hAnsi="Symbol" w:hint="default"/>
+        <w:sz w:val="20"/>
+      </w:rPr>
+    </w:lvl>
+    <w:lvl w:ilvl="1" w:tentative="1">
+      <w:start w:val="1"/>
+      <w:numFmt w:val="bullet"/>
+      <w:lvlText w:val="o"/>
+      <w:lvlJc w:val="left"/>
+      <w:pPr>
+        <w:tabs>
+          <w:tab w:val="num" w:pos="1440"/>
+        </w:tabs>
+        <w:ind w:left="1440" w:hanging="360"/>
+      </w:pPr>
+      <w:rPr>
+        <w:rFonts w:ascii="Courier New" w:hAnsi="Courier New" w:hint="default"/>
+        <w:sz w:val="20"/>
+      </w:rPr>
+    </w:lvl>
+    <w:lvl w:ilvl="2" w:tentative="1">
+      <w:start w:val="1"/>
+      <w:numFmt w:val="bullet"/>
+      <w:lvlText w:val=""/>
+      <w:lvlJc w:val="left"/>
+      <w:pPr>
+        <w:tabs>
+          <w:tab w:val="num" w:pos="2160"/>
+        </w:tabs>
+        <w:ind w:left="2160" w:hanging="360"/>
+      </w:pPr>
+      <w:rPr>
+        <w:rFonts w:ascii="Wingdings" w:hAnsi="Wingdings" w:hint="default"/>
+        <w:sz w:val="20"/>
+      </w:rPr>
+    </w:lvl>
+    <w:lvl w:ilvl="3" w:tentative="1">
+      <w:start w:val="1"/>
+      <w:numFmt w:val="bullet"/>
+      <w:lvlText w:val=""/>
+      <w:lvlJc w:val="left"/>
+      <w:pPr>
+        <w:tabs>
+          <w:tab w:val="num" w:pos="2880"/>
+        </w:tabs>
+        <w:ind w:left="2880" w:hanging="360"/>
+      </w:pPr>
+      <w:rPr>
+        <w:rFonts w:ascii="Wingdings" w:hAnsi="Wingdings" w:hint="default"/>
+        <w:sz w:val="20"/>
+      </w:rPr>
+    </w:lvl>
+    <w:lvl w:ilvl="4" w:tentative="1">
+      <w:start w:val="1"/>
+      <w:numFmt w:val="bullet"/>
+      <w:lvlText w:val=""/>
+      <w:lvlJc w:val="left"/>
+      <w:pPr>
+        <w:tabs>
+          <w:tab w:val="num" w:pos="3600"/>
+        </w:tabs>
+        <w:ind w:left="3600" w:hanging="360"/>
+      </w:pPr>
+      <w:rPr>
+        <w:rFonts w:ascii="Wingdings" w:hAnsi="Wingdings" w:hint="default"/>
+        <w:sz w:val="20"/>
+      </w:rPr>
+    </w:lvl>
+    <w:lvl w:ilvl="5" w:tentative="1">
+      <w:start w:val="1"/>
+      <w:numFmt w:val="bullet"/>
+      <w:lvlText w:val=""/>
+      <w:lvlJc w:val="left"/>
+      <w:pPr>
+        <w:tabs>
+          <w:tab w:val="num" w:pos="4320"/>
+        </w:tabs>
+        <w:ind w:left="4320" w:hanging="360"/>
+      </w:pPr>
+      <w:rPr>
+        <w:rFonts w:ascii="Wingdings" w:hAnsi="Wingdings" w:hint="default"/>
+        <w:sz w:val="20"/>
+      </w:rPr>
+    </w:lvl>
+    <w:lvl w:ilvl="6" w:tentative="1">
+      <w:start w:val="1"/>
+      <w:numFmt w:val="bullet"/>
+      <w:lvlText w:val=""/>
+      <w:lvlJc w:val="left"/>
+      <w:pPr>
+        <w:tabs>
+          <w:tab w:val="num" w:pos="5040"/>
+        </w:tabs>
+        <w:ind w:left="5040" w:hanging="360"/>
+      </w:pPr>
+      <w:rPr>
+        <w:rFonts w:ascii="Wingdings" w:hAnsi="Wingdings" w:hint="default"/>
+        <w:sz w:val="20"/>
+      </w:rPr>
+    </w:lvl>
+    <w:lvl w:ilvl="7" w:tentative="1">
+      <w:start w:val="1"/>
+      <w:numFmt w:val="bullet"/>
+      <w:lvlText w:val=""/>
+      <w:lvlJc w:val="left"/>
+      <w:pPr>
+        <w:tabs>
+          <w:tab w:val="num" w:pos="5760"/>
+        </w:tabs>
+        <w:ind w:left="5760" w:hanging="360"/>
+      </w:pPr>
+      <w:rPr>
+        <w:rFonts w:ascii="Wingdings" w:hAnsi="Wingdings" w:hint="default"/>
+        <w:sz w:val="20"/>
+      </w:rPr>
+    </w:lvl>
+    <w:lvl w:ilvl="8" w:tentative="1">
+      <w:start w:val="1"/>
+      <w:numFmt w:val="bullet"/>
+      <w:lvlText w:val=""/>
+      <w:lvlJc w:val="left"/>
+      <w:pPr>
+        <w:tabs>
+          <w:tab w:val="num" w:pos="6480"/>
+        </w:tabs>
+        <w:ind w:left="6480" w:hanging="360"/>
+      </w:pPr>
+      <w:rPr>
+        <w:rFonts w:ascii="Wingdings" w:hAnsi="Wingdings" w:hint="default"/>
+        <w:sz w:val="20"/>
+      </w:rPr>
+    </w:lvl>
+  </w:abstractNum>
+  <w:abstractNum w:abstractNumId="21" w15:restartNumberingAfterBreak="0">
     <w:nsid w:val="770A7ED2"/>
     <w:multiLevelType w:val="multilevel"/>
     <w:tmpl w:val="3ECA582A"/>
@@ -20485,7 +22820,7 @@
       </w:rPr>
     </w:lvl>
   </w:abstractNum>
-  <w:abstractNum w:abstractNumId="15" w15:restartNumberingAfterBreak="0">
+  <w:abstractNum w:abstractNumId="22" w15:restartNumberingAfterBreak="0">
     <w:nsid w:val="7E2531F3"/>
     <w:multiLevelType w:val="hybridMultilevel"/>
     <w:tmpl w:val="49FA6106"/>
@@ -20581,7 +22916,7 @@
     </w:lvl>
   </w:abstractNum>
   <w:num w:numId="1" w16cid:durableId="1336765716">
-    <w:abstractNumId w:val="12"/>
+    <w:abstractNumId w:val="16"/>
   </w:num>
   <w:num w:numId="2" w16cid:durableId="2058625653">
     <w:abstractNumId w:val="0"/>
@@ -20590,13 +22925,13 @@
     <w:abstractNumId w:val="1"/>
   </w:num>
   <w:num w:numId="4" w16cid:durableId="1258556996">
-    <w:abstractNumId w:val="15"/>
+    <w:abstractNumId w:val="22"/>
   </w:num>
   <w:num w:numId="5" w16cid:durableId="554897592">
     <w:abstractNumId w:val="5"/>
   </w:num>
   <w:num w:numId="6" w16cid:durableId="1757052792">
-    <w:abstractNumId w:val="12"/>
+    <w:abstractNumId w:val="16"/>
     <w:lvlOverride w:ilvl="0">
       <w:lvl w:ilvl="0">
         <w:start w:val="1"/>
@@ -20735,81 +23070,102 @@
     </w:lvlOverride>
   </w:num>
   <w:num w:numId="7" w16cid:durableId="648052521">
-    <w:abstractNumId w:val="12"/>
+    <w:abstractNumId w:val="16"/>
   </w:num>
   <w:num w:numId="8" w16cid:durableId="907155841">
-    <w:abstractNumId w:val="12"/>
+    <w:abstractNumId w:val="16"/>
   </w:num>
   <w:num w:numId="9" w16cid:durableId="368801592">
-    <w:abstractNumId w:val="12"/>
+    <w:abstractNumId w:val="16"/>
   </w:num>
   <w:num w:numId="10" w16cid:durableId="1464926626">
-    <w:abstractNumId w:val="12"/>
+    <w:abstractNumId w:val="16"/>
   </w:num>
   <w:num w:numId="11" w16cid:durableId="2139645227">
-    <w:abstractNumId w:val="12"/>
+    <w:abstractNumId w:val="16"/>
   </w:num>
   <w:num w:numId="12" w16cid:durableId="1860511845">
-    <w:abstractNumId w:val="12"/>
+    <w:abstractNumId w:val="16"/>
   </w:num>
   <w:num w:numId="13" w16cid:durableId="1265383204">
-    <w:abstractNumId w:val="12"/>
+    <w:abstractNumId w:val="16"/>
   </w:num>
   <w:num w:numId="14" w16cid:durableId="223225298">
-    <w:abstractNumId w:val="12"/>
+    <w:abstractNumId w:val="16"/>
   </w:num>
   <w:num w:numId="15" w16cid:durableId="1638871162">
-    <w:abstractNumId w:val="12"/>
+    <w:abstractNumId w:val="16"/>
   </w:num>
   <w:num w:numId="16" w16cid:durableId="364335209">
     <w:abstractNumId w:val="0"/>
   </w:num>
   <w:num w:numId="17" w16cid:durableId="21326236">
-    <w:abstractNumId w:val="12"/>
+    <w:abstractNumId w:val="16"/>
   </w:num>
   <w:num w:numId="18" w16cid:durableId="819228862">
-    <w:abstractNumId w:val="12"/>
+    <w:abstractNumId w:val="16"/>
   </w:num>
   <w:num w:numId="19" w16cid:durableId="1773671029">
-    <w:abstractNumId w:val="12"/>
+    <w:abstractNumId w:val="16"/>
   </w:num>
   <w:num w:numId="20" w16cid:durableId="957565544">
-    <w:abstractNumId w:val="13"/>
+    <w:abstractNumId w:val="18"/>
   </w:num>
   <w:num w:numId="21" w16cid:durableId="623194781">
     <w:abstractNumId w:val="3"/>
   </w:num>
   <w:num w:numId="22" w16cid:durableId="101658173">
-    <w:abstractNumId w:val="9"/>
+    <w:abstractNumId w:val="12"/>
   </w:num>
   <w:num w:numId="23" w16cid:durableId="1467233604">
     <w:abstractNumId w:val="2"/>
   </w:num>
   <w:num w:numId="24" w16cid:durableId="1909655735">
-    <w:abstractNumId w:val="12"/>
+    <w:abstractNumId w:val="16"/>
   </w:num>
   <w:num w:numId="25" w16cid:durableId="1727294871">
-    <w:abstractNumId w:val="12"/>
+    <w:abstractNumId w:val="16"/>
   </w:num>
   <w:num w:numId="26" w16cid:durableId="1412117275">
+    <w:abstractNumId w:val="15"/>
+  </w:num>
+  <w:num w:numId="27" w16cid:durableId="651249389">
+    <w:abstractNumId w:val="21"/>
+  </w:num>
+  <w:num w:numId="28" w16cid:durableId="752435551">
     <w:abstractNumId w:val="11"/>
   </w:num>
-  <w:num w:numId="27" w16cid:durableId="651249389">
-    <w:abstractNumId w:val="14"/>
-  </w:num>
-  <w:num w:numId="28" w16cid:durableId="752435551">
+  <w:num w:numId="29" w16cid:durableId="1653949252">
     <w:abstractNumId w:val="8"/>
-  </w:num>
-  <w:num w:numId="29" w16cid:durableId="1653949252">
-    <w:abstractNumId w:val="6"/>
   </w:num>
   <w:num w:numId="30" w16cid:durableId="1412657900">
     <w:abstractNumId w:val="4"/>
   </w:num>
   <w:num w:numId="31" w16cid:durableId="1988583361">
+    <w:abstractNumId w:val="9"/>
+  </w:num>
+  <w:num w:numId="32" w16cid:durableId="1678724867">
+    <w:abstractNumId w:val="14"/>
+  </w:num>
+  <w:num w:numId="33" w16cid:durableId="799422636">
+    <w:abstractNumId w:val="20"/>
+  </w:num>
+  <w:num w:numId="34" w16cid:durableId="601574874">
+    <w:abstractNumId w:val="13"/>
+  </w:num>
+  <w:num w:numId="35" w16cid:durableId="1720127878">
+    <w:abstractNumId w:val="17"/>
+  </w:num>
+  <w:num w:numId="36" w16cid:durableId="1418166028">
     <w:abstractNumId w:val="7"/>
   </w:num>
-  <w:num w:numId="32" w16cid:durableId="1678724867">
+  <w:num w:numId="37" w16cid:durableId="852915120">
+    <w:abstractNumId w:val="19"/>
+  </w:num>
+  <w:num w:numId="38" w16cid:durableId="1988317352">
+    <w:abstractNumId w:val="6"/>
+  </w:num>
+  <w:num w:numId="39" w16cid:durableId="745105466">
     <w:abstractNumId w:val="10"/>
   </w:num>
   <w:numIdMacAtCleanup w:val="2"/>
@@ -21258,7 +23614,7 @@
     <w:autoRedefine/>
     <w:uiPriority w:val="9"/>
     <w:qFormat/>
-    <w:rsid w:val="00B3761B"/>
+    <w:rsid w:val="00E514AA"/>
     <w:pPr>
       <w:keepNext/>
       <w:keepLines/>
@@ -21275,6 +23631,7 @@
       <w:bCs/>
       <w:sz w:val="24"/>
       <w:szCs w:val="26"/>
+      <w:lang w:val="en-US"/>
     </w:rPr>
   </w:style>
   <w:style w:type="paragraph" w:styleId="Heading3">
@@ -21459,7 +23816,6 @@
   <w:style w:type="character" w:default="1" w:styleId="DefaultParagraphFont">
     <w:name w:val="Default Paragraph Font"/>
     <w:uiPriority w:val="1"/>
-    <w:semiHidden/>
     <w:unhideWhenUsed/>
   </w:style>
   <w:style w:type="table" w:default="1" w:styleId="TableNormal">
@@ -21520,14 +23876,14 @@
     <w:basedOn w:val="DefaultParagraphFont"/>
     <w:link w:val="Heading2"/>
     <w:uiPriority w:val="9"/>
-    <w:rsid w:val="00B3761B"/>
+    <w:rsid w:val="00E514AA"/>
     <w:rPr>
       <w:rFonts w:ascii="Times New Roman" w:eastAsiaTheme="majorEastAsia" w:hAnsi="Times New Roman" w:cstheme="majorBidi"/>
       <w:b/>
       <w:bCs/>
       <w:sz w:val="24"/>
       <w:szCs w:val="26"/>
-      <w:lang w:val="en-GB"/>
+      <w:lang w:val="en-US"/>
     </w:rPr>
   </w:style>
   <w:style w:type="character" w:customStyle="1" w:styleId="Heading1Char">
@@ -23414,12 +25770,15 @@
     <w:rsid w:val="000A33B9"/>
     <w:rsid w:val="000A5295"/>
     <w:rsid w:val="001206B2"/>
+    <w:rsid w:val="001D7A76"/>
     <w:rsid w:val="00251CB5"/>
     <w:rsid w:val="00276E9C"/>
     <w:rsid w:val="00306129"/>
+    <w:rsid w:val="003A625E"/>
     <w:rsid w:val="003A6C19"/>
     <w:rsid w:val="0047379A"/>
     <w:rsid w:val="00482D3D"/>
+    <w:rsid w:val="00585DEB"/>
     <w:rsid w:val="00690D79"/>
     <w:rsid w:val="007376D8"/>
     <w:rsid w:val="00742F18"/>
@@ -23430,6 +25789,7 @@
     <w:rsid w:val="008E0ECC"/>
     <w:rsid w:val="00B0485F"/>
     <w:rsid w:val="00B96221"/>
+    <w:rsid w:val="00BC10BD"/>
     <w:rsid w:val="00BC10D4"/>
     <w:rsid w:val="00C55DC5"/>
     <w:rsid w:val="00C6481E"/>

</xml_diff>